<commit_message>
Safety Commit before France
</commit_message>
<xml_diff>
--- a/docs/docx writings/Argumentation against economical viabillity of eSMR.docx
+++ b/docs/docx writings/Argumentation against economical viabillity of eSMR.docx
@@ -20,23 +20,19 @@
           <w:szCs w:val="20"/>
           <w:u w:val="single"/>
         </w:rPr>
-        <w:t>Methodology</w:t>
+        <w:t>Comparison to Conventional SMR Process</w:t>
       </w:r>
     </w:p>
     <w:p>
       <w:pPr>
         <w:rPr>
-          <w:sz w:val="20"/>
-          <w:szCs w:val="20"/>
-        </w:rPr>
-      </w:pPr>
-      <w:r>
-        <w:rPr>
-          <w:sz w:val="20"/>
-          <w:szCs w:val="20"/>
-        </w:rPr>
-        <w:t>The additional energy demand of conventional SMR relative to eSMR was decomposed into (i) feed preheating and reaction enthalpy, and (ii) irrecoverable thermal losses in the firebox and radiant section — comprising flue gas losses (6–10%) and insulation losses (1–5% of fired energy) [Ullmann's]. Under ideal heat integration, contribution (i) is fully recovered as steam export, rendering it economically equivalent to dedicated NG-fired steam generation at sites operating under a net steam deficit. The net differentiator therefore reduces to the irrecoverable thermal losses of conventional SMR.</w:t>
-      </w:r>
+          <w:b/>
+          <w:bCs/>
+          <w:sz w:val="20"/>
+          <w:szCs w:val="20"/>
+          <w:u w:val="single"/>
+        </w:rPr>
+      </w:pPr>
     </w:p>
     <w:p>
       <w:pPr>
@@ -50,94 +46,306 @@
           <w:sz w:val="20"/>
           <w:szCs w:val="20"/>
         </w:rPr>
-        <w:t xml:space="preserve">The electricity-to-natural gas price ratio was evaluated for Germany, the United States, and China using 2019 industrial energy prices as a pre-crisis baseline [5,6], accounting for the fact that the reaction enthalpy — near-identical in both processes — is supplied by different energy carriers: natural gas in conventional SMR and electricity in eSMR. The CO₂ certificate price required to close the residual economic gap was then derived analytically using the natural gas emission factor </w:t>
-      </w:r>
-      <m:oMath>
-        <m:sSub>
-          <m:sSubPr>
-            <m:ctrlPr>
-              <w:rPr>
-                <w:rFonts w:ascii="Cambria Math" w:hAnsi="Cambria Math"/>
-                <w:sz w:val="20"/>
-                <w:szCs w:val="20"/>
-              </w:rPr>
-            </m:ctrlPr>
-          </m:sSubPr>
-          <m:e>
-            <m:r>
-              <w:rPr>
-                <w:rFonts w:ascii="Cambria Math" w:hAnsi="Cambria Math"/>
-                <w:sz w:val="20"/>
-                <w:szCs w:val="20"/>
-              </w:rPr>
-              <m:t>EF</m:t>
-            </m:r>
-          </m:e>
-          <m:sub>
-            <m:r>
-              <m:rPr>
-                <m:nor/>
-              </m:rPr>
-              <w:rPr>
-                <w:sz w:val="20"/>
-                <w:szCs w:val="20"/>
-              </w:rPr>
-              <m:t>NG</m:t>
-            </m:r>
-          </m:sub>
-        </m:sSub>
-      </m:oMath>
-      <w:r>
-        <w:rPr>
-          <w:sz w:val="20"/>
-          <w:szCs w:val="20"/>
-        </w:rPr>
-        <w:t xml:space="preserve"> = 0.205 t CO₂/</w:t>
-      </w:r>
-      <m:oMath>
-        <m:sSub>
-          <m:sSubPr>
-            <m:ctrlPr>
-              <w:rPr>
-                <w:rFonts w:ascii="Cambria Math" w:hAnsi="Cambria Math"/>
-                <w:sz w:val="20"/>
-                <w:szCs w:val="20"/>
-              </w:rPr>
-            </m:ctrlPr>
-          </m:sSubPr>
-          <m:e>
-            <m:r>
-              <m:rPr>
-                <m:sty m:val="p"/>
-              </m:rPr>
-              <w:rPr>
-                <w:rFonts w:ascii="Cambria Math" w:hAnsi="Cambria Math"/>
-                <w:sz w:val="20"/>
-                <w:szCs w:val="20"/>
-              </w:rPr>
-              <m:t>MWh</m:t>
-            </m:r>
-          </m:e>
-          <m:sub>
-            <m:r>
-              <m:rPr>
-                <m:nor/>
-              </m:rPr>
-              <w:rPr>
-                <w:sz w:val="20"/>
-                <w:szCs w:val="20"/>
-              </w:rPr>
-              <m:t>NG</m:t>
-            </m:r>
-          </m:sub>
-        </m:sSub>
-      </m:oMath>
-      <w:r>
-        <w:rPr>
-          <w:sz w:val="20"/>
-          <w:szCs w:val="20"/>
-        </w:rPr>
-        <w:t xml:space="preserve"> [Umweltbundesamt, 2022]:</w:t>
+        <w:t>For SMR-based hydrogen production</w:t>
+      </w:r>
+      <w:r>
+        <w:rPr>
+          <w:sz w:val="20"/>
+          <w:szCs w:val="20"/>
+        </w:rPr>
+        <w:t xml:space="preserve"> from natural gas</w:t>
+      </w:r>
+      <w:r>
+        <w:rPr>
+          <w:sz w:val="20"/>
+          <w:szCs w:val="20"/>
+        </w:rPr>
+        <w:t xml:space="preserve"> (NG)</w:t>
+      </w:r>
+      <w:r>
+        <w:rPr>
+          <w:sz w:val="20"/>
+          <w:szCs w:val="20"/>
+        </w:rPr>
+        <w:t xml:space="preserve">, </w:t>
+      </w:r>
+      <w:r>
+        <w:rPr>
+          <w:b/>
+          <w:bCs/>
+          <w:sz w:val="20"/>
+          <w:szCs w:val="20"/>
+        </w:rPr>
+        <w:t>capital expenditures</w:t>
+      </w:r>
+      <w:r>
+        <w:rPr>
+          <w:sz w:val="20"/>
+          <w:szCs w:val="20"/>
+        </w:rPr>
+        <w:t xml:space="preserve"> (</w:t>
+      </w:r>
+      <w:r>
+        <w:rPr>
+          <w:sz w:val="20"/>
+          <w:szCs w:val="20"/>
+        </w:rPr>
+        <w:t>CAPEX</w:t>
+      </w:r>
+      <w:r>
+        <w:rPr>
+          <w:sz w:val="20"/>
+          <w:szCs w:val="20"/>
+        </w:rPr>
+        <w:t>)</w:t>
+      </w:r>
+      <w:r>
+        <w:rPr>
+          <w:sz w:val="20"/>
+          <w:szCs w:val="20"/>
+        </w:rPr>
+        <w:t xml:space="preserve"> is of </w:t>
+      </w:r>
+      <w:r>
+        <w:rPr>
+          <w:b/>
+          <w:bCs/>
+          <w:sz w:val="20"/>
+          <w:szCs w:val="20"/>
+        </w:rPr>
+        <w:t>secondary</w:t>
+      </w:r>
+      <w:r>
+        <w:rPr>
+          <w:sz w:val="20"/>
+          <w:szCs w:val="20"/>
+        </w:rPr>
+        <w:t xml:space="preserve"> </w:t>
+      </w:r>
+      <w:r>
+        <w:rPr>
+          <w:b/>
+          <w:bCs/>
+          <w:sz w:val="20"/>
+          <w:szCs w:val="20"/>
+        </w:rPr>
+        <w:t>importance</w:t>
+      </w:r>
+      <w:r>
+        <w:rPr>
+          <w:sz w:val="20"/>
+          <w:szCs w:val="20"/>
+        </w:rPr>
+        <w:t xml:space="preserve"> to economic viability, as </w:t>
+      </w:r>
+      <w:r>
+        <w:rPr>
+          <w:sz w:val="20"/>
+          <w:szCs w:val="20"/>
+        </w:rPr>
+        <w:t>operating expenditures (</w:t>
+      </w:r>
+      <w:r>
+        <w:rPr>
+          <w:sz w:val="20"/>
+          <w:szCs w:val="20"/>
+        </w:rPr>
+        <w:t>OPEX</w:t>
+      </w:r>
+      <w:r>
+        <w:rPr>
+          <w:sz w:val="20"/>
+          <w:szCs w:val="20"/>
+        </w:rPr>
+        <w:t>)</w:t>
+      </w:r>
+      <w:r>
+        <w:rPr>
+          <w:sz w:val="20"/>
+          <w:szCs w:val="20"/>
+        </w:rPr>
+        <w:t xml:space="preserve"> </w:t>
+      </w:r>
+      <w:r>
+        <w:rPr>
+          <w:sz w:val="20"/>
+          <w:szCs w:val="20"/>
+        </w:rPr>
+        <w:t>–</w:t>
+      </w:r>
+      <w:r>
+        <w:rPr>
+          <w:sz w:val="20"/>
+          <w:szCs w:val="20"/>
+        </w:rPr>
+        <w:t xml:space="preserve"> dominated by </w:t>
+      </w:r>
+      <w:r>
+        <w:rPr>
+          <w:b/>
+          <w:bCs/>
+          <w:sz w:val="20"/>
+          <w:szCs w:val="20"/>
+        </w:rPr>
+        <w:t>NG</w:t>
+      </w:r>
+      <w:r>
+        <w:rPr>
+          <w:b/>
+          <w:bCs/>
+          <w:sz w:val="20"/>
+          <w:szCs w:val="20"/>
+        </w:rPr>
+        <w:t xml:space="preserve"> feedstock costs</w:t>
+      </w:r>
+      <w:r>
+        <w:rPr>
+          <w:sz w:val="20"/>
+          <w:szCs w:val="20"/>
+        </w:rPr>
+        <w:t xml:space="preserve"> (45</w:t>
+      </w:r>
+      <w:r>
+        <w:rPr>
+          <w:sz w:val="20"/>
+          <w:szCs w:val="20"/>
+        </w:rPr>
+        <w:t>-</w:t>
+      </w:r>
+      <w:r>
+        <w:rPr>
+          <w:sz w:val="20"/>
+          <w:szCs w:val="20"/>
+        </w:rPr>
+        <w:t>75% of total production costs</w:t>
+      </w:r>
+      <w:r>
+        <w:rPr>
+          <w:sz w:val="20"/>
+          <w:szCs w:val="20"/>
+        </w:rPr>
+        <w:t xml:space="preserve"> [1]</w:t>
+      </w:r>
+      <w:r>
+        <w:rPr>
+          <w:sz w:val="20"/>
+          <w:szCs w:val="20"/>
+        </w:rPr>
+        <w:t xml:space="preserve">) </w:t>
+      </w:r>
+      <w:r>
+        <w:rPr>
+          <w:sz w:val="20"/>
+          <w:szCs w:val="20"/>
+        </w:rPr>
+        <w:t>–</w:t>
+      </w:r>
+      <w:r>
+        <w:rPr>
+          <w:sz w:val="20"/>
+          <w:szCs w:val="20"/>
+        </w:rPr>
+        <w:t xml:space="preserve"> constitutes the </w:t>
+      </w:r>
+      <w:r>
+        <w:rPr>
+          <w:b/>
+          <w:bCs/>
+          <w:sz w:val="20"/>
+          <w:szCs w:val="20"/>
+        </w:rPr>
+        <w:t>primary cost driver</w:t>
+      </w:r>
+      <w:r>
+        <w:rPr>
+          <w:sz w:val="20"/>
+          <w:szCs w:val="20"/>
+        </w:rPr>
+        <w:t xml:space="preserve">. Including CCUS, </w:t>
+      </w:r>
+      <w:r>
+        <w:rPr>
+          <w:sz w:val="20"/>
+          <w:szCs w:val="20"/>
+        </w:rPr>
+        <w:t>CAPEX</w:t>
+      </w:r>
+      <w:r>
+        <w:rPr>
+          <w:sz w:val="20"/>
+          <w:szCs w:val="20"/>
+        </w:rPr>
+        <w:t xml:space="preserve"> </w:t>
+      </w:r>
+      <w:r>
+        <w:rPr>
+          <w:sz w:val="20"/>
+          <w:szCs w:val="20"/>
+        </w:rPr>
+        <w:t xml:space="preserve">is between 25% in high-fuel-cost-regions like Europe or China and 40% in low-fuel-cost regions like </w:t>
+      </w:r>
+      <w:r>
+        <w:rPr>
+          <w:sz w:val="20"/>
+          <w:szCs w:val="20"/>
+        </w:rPr>
+        <w:t xml:space="preserve">Middle East or US [1]. Especially in Europe it can be as low as 7% according </w:t>
+      </w:r>
+      <w:r>
+        <w:rPr>
+          <w:sz w:val="20"/>
+          <w:szCs w:val="20"/>
+        </w:rPr>
+        <w:t xml:space="preserve">to </w:t>
+      </w:r>
+      <w:r>
+        <w:rPr>
+          <w:sz w:val="20"/>
+          <w:szCs w:val="20"/>
+        </w:rPr>
+        <w:t xml:space="preserve">other studies [2]. This highlights that </w:t>
+      </w:r>
+      <w:r>
+        <w:rPr>
+          <w:sz w:val="20"/>
+          <w:szCs w:val="20"/>
+        </w:rPr>
+        <w:t xml:space="preserve">the </w:t>
+      </w:r>
+      <w:r>
+        <w:rPr>
+          <w:sz w:val="20"/>
+          <w:szCs w:val="20"/>
+        </w:rPr>
+        <w:t xml:space="preserve">CAPEX share </w:t>
+      </w:r>
+      <w:r>
+        <w:rPr>
+          <w:sz w:val="20"/>
+          <w:szCs w:val="20"/>
+        </w:rPr>
+        <w:t>depends heavily on the</w:t>
+      </w:r>
+      <w:r>
+        <w:rPr>
+          <w:sz w:val="20"/>
+          <w:szCs w:val="20"/>
+        </w:rPr>
+        <w:t xml:space="preserve"> assumptions</w:t>
+      </w:r>
+      <w:r>
+        <w:rPr>
+          <w:sz w:val="20"/>
+          <w:szCs w:val="20"/>
+        </w:rPr>
+        <w:t xml:space="preserve"> made</w:t>
+      </w:r>
+      <w:r>
+        <w:rPr>
+          <w:sz w:val="20"/>
+          <w:szCs w:val="20"/>
+        </w:rPr>
+        <w:t>.</w:t>
       </w:r>
     </w:p>
     <w:p>
@@ -152,7 +360,35 @@
           <w:sz w:val="20"/>
           <w:szCs w:val="20"/>
         </w:rPr>
-        <w:t>This threshold was compared against current EU ETS carbon price levels to assess whether CO₂ pricing materially alters the conclusions.</w:t>
+        <w:t xml:space="preserve">Consequently, for process configurations of similar plant topology, a block flow diagram </w:t>
+      </w:r>
+      <w:r>
+        <w:rPr>
+          <w:sz w:val="20"/>
+          <w:szCs w:val="20"/>
+        </w:rPr>
+        <w:t>l</w:t>
+      </w:r>
+      <w:r>
+        <w:rPr>
+          <w:sz w:val="20"/>
+          <w:szCs w:val="20"/>
+        </w:rPr>
+        <w:t>evel assessment is sufficient to draw first-order conclusions on economic competitiveness</w:t>
+      </w:r>
+      <w:r>
+        <w:rPr>
+          <w:sz w:val="20"/>
+          <w:szCs w:val="20"/>
+        </w:rPr>
+        <w:t xml:space="preserve">, </w:t>
+      </w:r>
+      <w:r>
+        <w:rPr>
+          <w:sz w:val="20"/>
+          <w:szCs w:val="20"/>
+        </w:rPr>
+        <w:t>since variations in equipment layout and capital intensity are unlikely to alter the fundamental dominance of OPEX.</w:t>
       </w:r>
     </w:p>
     <w:p>
@@ -175,1598 +411,126 @@
           <w:sz w:val="20"/>
           <w:szCs w:val="20"/>
         </w:rPr>
-        <w:t>The additional energy demand of post-combustion CO₂ capture relative to pre-combustion capture was derived from the techno-economic simulation results reported by IEAGHG (2017) for an SMR-based merchant hydrogen plant. Two energy components were quantified separately: the thermal energy required for solvent regeneration in the stripper reboiler, and the electrical energy consumed by the capture and compression units, including auxiliary loads. The reboiler duty was calculated directly from the reported LP steam consumption of the CO₂ capture plant (64.4 t/h for pre-combustion MDEA, 96.4 t/h for post-combustion MEA) multiplied by the specific enthalpy difference between LP steam (0.44 MPa, 177 °C; h ≈ 2810 kJ/kg) and saturated condensate return (0.44 MPa, 147 °C; h ≈ 620 kJ/kg) from NIST steam tables</w:t>
-      </w:r>
-      <w:r>
-        <w:rPr>
-          <w:sz w:val="20"/>
-          <w:szCs w:val="20"/>
-        </w:rPr>
-        <w:t xml:space="preserve">. </w:t>
-      </w:r>
-      <w:r>
-        <w:rPr>
-          <w:sz w:val="20"/>
-          <w:szCs w:val="20"/>
-        </w:rPr>
-        <w:t>The electrical penalty was determined as the sum of differential power consumption of the hydrogen plant, COGEN auxiliaries/BoP, CO₂ capture plant, and CO₂ compression and drying unit, taken directly from the simulation results. Both energy components were normalized to the natural gas feedstock energy input (LHV basis) to enable transferability to other applications. To express both energy forms on a common primary-energy basis, the reboiler heat was divided by a boiler efficiency of 0.95 to account for the additional fuel required in a standalone installation, while the electrical demand was converted to primary energy using a factor of 2.5, corresponding to an average grid generation efficiency of approximately 40%. The incremental energy penalty of post-combustion over pre-combustion capture is reported as the sum of both contributions, expressed as a fraction of the natural gas feedstock energy</w:t>
-      </w:r>
-      <w:r>
-        <w:rPr>
-          <w:sz w:val="20"/>
-          <w:szCs w:val="20"/>
-        </w:rPr>
-        <w:t xml:space="preserve"> input on an LHV basis to allow comparison across applications</w:t>
-      </w:r>
-      <w:r>
-        <w:rPr>
-          <w:sz w:val="20"/>
-          <w:szCs w:val="20"/>
-        </w:rPr>
-        <w:t>.</w:t>
-      </w:r>
-    </w:p>
-    <w:p>
-      <w:pPr>
-        <w:rPr>
-          <w:sz w:val="20"/>
-          <w:szCs w:val="20"/>
-        </w:rPr>
-      </w:pPr>
-    </w:p>
-    <w:p>
-      <w:pPr>
-        <w:rPr>
-          <w:sz w:val="20"/>
-          <w:szCs w:val="20"/>
-        </w:rPr>
-      </w:pPr>
-      <w:r>
-        <w:rPr>
-          <w:sz w:val="20"/>
-          <w:szCs w:val="20"/>
-        </w:rPr>
-        <w:t>The energetic effect of high-pressure operation was assessed by comparing the pressure work associated with conventional pressure reduction of the natural</w:t>
-      </w:r>
-      <w:r>
-        <w:rPr>
-          <w:sz w:val="20"/>
-          <w:szCs w:val="20"/>
-        </w:rPr>
-        <w:t xml:space="preserve"> </w:t>
-      </w:r>
-      <w:r>
-        <w:rPr>
-          <w:sz w:val="20"/>
-          <w:szCs w:val="20"/>
-        </w:rPr>
-        <w:t>gas feed and subsequent recompression of the hydrogen product. Both steps were treated as ideal-gas, isentropic processes corrected by representative isentropic machine efficiencies. The isentropic exponents were calculated from temperature-dependent heat capacities according to </w:t>
-      </w:r>
-      <m:oMath>
-        <m:r>
-          <w:rPr>
-            <w:rFonts w:ascii="Cambria Math" w:hAnsi="Cambria Math"/>
-            <w:sz w:val="20"/>
-            <w:szCs w:val="20"/>
-          </w:rPr>
-          <m:t>γ</m:t>
-        </m:r>
-        <m:r>
-          <m:rPr>
-            <m:sty m:val="p"/>
-          </m:rPr>
-          <w:rPr>
-            <w:rFonts w:ascii="Cambria Math" w:hAnsi="Cambria Math"/>
-            <w:sz w:val="20"/>
-            <w:szCs w:val="20"/>
-          </w:rPr>
-          <m:t>=</m:t>
-        </m:r>
-        <m:sSub>
-          <m:sSubPr>
-            <m:ctrlPr>
-              <w:rPr>
-                <w:rFonts w:ascii="Cambria Math" w:hAnsi="Cambria Math"/>
-                <w:sz w:val="20"/>
-                <w:szCs w:val="20"/>
-              </w:rPr>
-            </m:ctrlPr>
-          </m:sSubPr>
-          <m:e>
-            <m:r>
-              <w:rPr>
-                <w:rFonts w:ascii="Cambria Math" w:hAnsi="Cambria Math"/>
-                <w:sz w:val="20"/>
-                <w:szCs w:val="20"/>
-              </w:rPr>
-              <m:t>c</m:t>
-            </m:r>
-          </m:e>
-          <m:sub>
-            <m:r>
-              <w:rPr>
-                <w:rFonts w:ascii="Cambria Math" w:hAnsi="Cambria Math"/>
-                <w:sz w:val="20"/>
-                <w:szCs w:val="20"/>
-              </w:rPr>
-              <m:t>p</m:t>
-            </m:r>
-          </m:sub>
-        </m:sSub>
-        <m:r>
-          <m:rPr>
-            <m:sty m:val="p"/>
-          </m:rPr>
-          <w:rPr>
-            <w:rFonts w:ascii="Cambria Math" w:hAnsi="Cambria Math"/>
-            <w:sz w:val="20"/>
-            <w:szCs w:val="20"/>
-          </w:rPr>
-          <m:t>/</m:t>
-        </m:r>
-        <m:r>
-          <m:rPr>
-            <m:sty m:val="p"/>
-          </m:rPr>
-          <w:rPr>
-            <w:rFonts w:ascii="Cambria Math" w:hAnsi="Cambria Math"/>
-            <w:sz w:val="20"/>
-            <w:szCs w:val="20"/>
-          </w:rPr>
-          <m:t>(</m:t>
-        </m:r>
-        <m:sSub>
-          <m:sSubPr>
-            <m:ctrlPr>
-              <w:rPr>
-                <w:rFonts w:ascii="Cambria Math" w:hAnsi="Cambria Math"/>
-                <w:sz w:val="20"/>
-                <w:szCs w:val="20"/>
-              </w:rPr>
-            </m:ctrlPr>
-          </m:sSubPr>
-          <m:e>
-            <m:r>
-              <w:rPr>
-                <w:rFonts w:ascii="Cambria Math" w:hAnsi="Cambria Math"/>
-                <w:sz w:val="20"/>
-                <w:szCs w:val="20"/>
-              </w:rPr>
-              <m:t>c</m:t>
-            </m:r>
-          </m:e>
-          <m:sub>
-            <m:r>
-              <w:rPr>
-                <w:rFonts w:ascii="Cambria Math" w:hAnsi="Cambria Math"/>
-                <w:sz w:val="20"/>
-                <w:szCs w:val="20"/>
-              </w:rPr>
-              <m:t>p</m:t>
-            </m:r>
-          </m:sub>
-        </m:sSub>
-        <m:r>
-          <m:rPr>
-            <m:sty m:val="p"/>
-          </m:rPr>
-          <w:rPr>
-            <w:rFonts w:ascii="Cambria Math" w:hAnsi="Cambria Math"/>
-            <w:sz w:val="20"/>
-            <w:szCs w:val="20"/>
-          </w:rPr>
-          <m:t>-</m:t>
-        </m:r>
-        <m:r>
-          <w:rPr>
-            <w:rFonts w:ascii="Cambria Math" w:hAnsi="Cambria Math"/>
-            <w:sz w:val="20"/>
-            <w:szCs w:val="20"/>
-          </w:rPr>
-          <m:t>R</m:t>
-        </m:r>
-        <m:r>
-          <m:rPr>
-            <m:sty m:val="p"/>
-          </m:rPr>
-          <w:rPr>
-            <w:rFonts w:ascii="Cambria Math" w:hAnsi="Cambria Math"/>
-            <w:sz w:val="20"/>
-            <w:szCs w:val="20"/>
-          </w:rPr>
-          <m:t>)</m:t>
-        </m:r>
-      </m:oMath>
-      <w:r>
-        <w:rPr>
-          <w:sz w:val="20"/>
-          <w:szCs w:val="20"/>
-        </w:rPr>
-        <w:t>, using </w:t>
-      </w:r>
-      <m:oMath>
-        <m:sSub>
-          <m:sSubPr>
-            <m:ctrlPr>
-              <w:rPr>
-                <w:rFonts w:ascii="Cambria Math" w:hAnsi="Cambria Math"/>
-                <w:sz w:val="20"/>
-                <w:szCs w:val="20"/>
-              </w:rPr>
-            </m:ctrlPr>
-          </m:sSubPr>
-          <m:e>
-            <m:r>
-              <w:rPr>
-                <w:rFonts w:ascii="Cambria Math" w:hAnsi="Cambria Math"/>
-                <w:sz w:val="20"/>
-                <w:szCs w:val="20"/>
-              </w:rPr>
-              <m:t>c</m:t>
-            </m:r>
-          </m:e>
-          <m:sub>
-            <m:r>
-              <w:rPr>
-                <w:rFonts w:ascii="Cambria Math" w:hAnsi="Cambria Math"/>
-                <w:sz w:val="20"/>
-                <w:szCs w:val="20"/>
-              </w:rPr>
-              <m:t>p</m:t>
-            </m:r>
-          </m:sub>
-        </m:sSub>
-      </m:oMath>
-      <w:r>
-        <w:rPr>
-          <w:sz w:val="20"/>
-          <w:szCs w:val="20"/>
-        </w:rPr>
-        <w:t> values for methane and hydrogen at the selected reference temperature, resulting in </w:t>
-      </w:r>
-      <m:oMath>
-        <m:sSub>
-          <m:sSubPr>
-            <m:ctrlPr>
-              <w:rPr>
-                <w:rFonts w:ascii="Cambria Math" w:hAnsi="Cambria Math"/>
-                <w:sz w:val="20"/>
-                <w:szCs w:val="20"/>
-              </w:rPr>
-            </m:ctrlPr>
-          </m:sSubPr>
-          <m:e>
-            <m:r>
-              <w:rPr>
-                <w:rFonts w:ascii="Cambria Math" w:hAnsi="Cambria Math"/>
-                <w:sz w:val="20"/>
-                <w:szCs w:val="20"/>
-              </w:rPr>
-              <m:t>γ</m:t>
-            </m:r>
-          </m:e>
-          <m:sub>
-            <m:r>
-              <w:rPr>
-                <w:rFonts w:ascii="Cambria Math" w:hAnsi="Cambria Math"/>
-                <w:sz w:val="20"/>
-                <w:szCs w:val="20"/>
-              </w:rPr>
-              <m:t>CH</m:t>
-            </m:r>
-            <m:r>
-              <m:rPr>
-                <m:sty m:val="p"/>
-              </m:rPr>
-              <w:rPr>
-                <w:rFonts w:ascii="Cambria Math" w:hAnsi="Cambria Math"/>
-                <w:sz w:val="20"/>
-                <w:szCs w:val="20"/>
-              </w:rPr>
-              <m:t>4</m:t>
-            </m:r>
-          </m:sub>
-        </m:sSub>
-        <m:r>
-          <m:rPr>
-            <m:sty m:val="p"/>
-          </m:rPr>
-          <w:rPr>
-            <w:rFonts w:ascii="Cambria Math" w:hAnsi="Cambria Math"/>
-            <w:sz w:val="20"/>
-            <w:szCs w:val="20"/>
-          </w:rPr>
-          <m:t>≈1.30</m:t>
-        </m:r>
-      </m:oMath>
-      <w:r>
-        <w:rPr>
-          <w:sz w:val="20"/>
-          <w:szCs w:val="20"/>
-        </w:rPr>
-        <w:t> and </w:t>
-      </w:r>
-      <m:oMath>
-        <m:sSub>
-          <m:sSubPr>
-            <m:ctrlPr>
-              <w:rPr>
-                <w:rFonts w:ascii="Cambria Math" w:hAnsi="Cambria Math"/>
-                <w:sz w:val="20"/>
-                <w:szCs w:val="20"/>
-              </w:rPr>
-            </m:ctrlPr>
-          </m:sSubPr>
-          <m:e>
-            <m:r>
-              <w:rPr>
-                <w:rFonts w:ascii="Cambria Math" w:hAnsi="Cambria Math"/>
-                <w:sz w:val="20"/>
-                <w:szCs w:val="20"/>
-              </w:rPr>
-              <m:t>γ</m:t>
-            </m:r>
-          </m:e>
-          <m:sub>
-            <m:r>
-              <w:rPr>
-                <w:rFonts w:ascii="Cambria Math" w:hAnsi="Cambria Math"/>
-                <w:sz w:val="20"/>
-                <w:szCs w:val="20"/>
-              </w:rPr>
-              <m:t>H</m:t>
-            </m:r>
-            <m:r>
-              <m:rPr>
-                <m:sty m:val="p"/>
-              </m:rPr>
-              <w:rPr>
-                <w:rFonts w:ascii="Cambria Math" w:hAnsi="Cambria Math"/>
-                <w:sz w:val="20"/>
-                <w:szCs w:val="20"/>
-              </w:rPr>
-              <m:t>2</m:t>
-            </m:r>
-          </m:sub>
-        </m:sSub>
-        <m:r>
-          <m:rPr>
-            <m:sty m:val="p"/>
-          </m:rPr>
-          <w:rPr>
-            <w:rFonts w:ascii="Cambria Math" w:hAnsi="Cambria Math"/>
-            <w:sz w:val="20"/>
-            <w:szCs w:val="20"/>
-          </w:rPr>
-          <m:t>≈1.41</m:t>
-        </m:r>
-      </m:oMath>
-      <w:r>
-        <w:rPr>
-          <w:sz w:val="20"/>
-          <w:szCs w:val="20"/>
-        </w:rPr>
-        <w:t>. The recoverable expansion work of the natural</w:t>
-      </w:r>
-      <w:r>
-        <w:rPr>
-          <w:sz w:val="20"/>
-          <w:szCs w:val="20"/>
-        </w:rPr>
-        <w:t xml:space="preserve"> </w:t>
-      </w:r>
-      <w:r>
-        <w:rPr>
-          <w:sz w:val="20"/>
-          <w:szCs w:val="20"/>
-        </w:rPr>
-        <w:t>gas stream and the required hydrogen compression work were calculated from the molar-flow-based isentropic work expressions, with real-machine corrections </w:t>
-      </w:r>
-      <m:oMath>
-        <m:sSub>
-          <m:sSubPr>
-            <m:ctrlPr>
-              <w:rPr>
-                <w:rFonts w:ascii="Cambria Math" w:hAnsi="Cambria Math"/>
-                <w:sz w:val="20"/>
-                <w:szCs w:val="20"/>
-              </w:rPr>
-            </m:ctrlPr>
-          </m:sSubPr>
-          <m:e>
-            <m:r>
-              <w:rPr>
-                <w:rFonts w:ascii="Cambria Math" w:hAnsi="Cambria Math"/>
-                <w:sz w:val="20"/>
-                <w:szCs w:val="20"/>
-              </w:rPr>
-              <m:t>W</m:t>
-            </m:r>
-          </m:e>
-          <m:sub>
-            <m:r>
-              <w:rPr>
-                <w:rFonts w:ascii="Cambria Math" w:hAnsi="Cambria Math"/>
-                <w:sz w:val="20"/>
-                <w:szCs w:val="20"/>
-              </w:rPr>
-              <m:t>E</m:t>
-            </m:r>
-            <m:r>
-              <m:rPr>
-                <m:sty m:val="p"/>
-              </m:rPr>
-              <w:rPr>
-                <w:rFonts w:ascii="Cambria Math" w:hAnsi="Cambria Math"/>
-                <w:sz w:val="20"/>
-                <w:szCs w:val="20"/>
-              </w:rPr>
-              <m:t>,</m:t>
-            </m:r>
-            <m:r>
-              <w:rPr>
-                <w:rFonts w:ascii="Cambria Math" w:hAnsi="Cambria Math"/>
-                <w:sz w:val="20"/>
-                <w:szCs w:val="20"/>
-              </w:rPr>
-              <m:t>real</m:t>
-            </m:r>
-          </m:sub>
-        </m:sSub>
-        <m:r>
-          <m:rPr>
-            <m:sty m:val="p"/>
-          </m:rPr>
-          <w:rPr>
-            <w:rFonts w:ascii="Cambria Math" w:hAnsi="Cambria Math"/>
-            <w:sz w:val="20"/>
-            <w:szCs w:val="20"/>
-          </w:rPr>
-          <m:t>=</m:t>
-        </m:r>
-        <m:sSub>
-          <m:sSubPr>
-            <m:ctrlPr>
-              <w:rPr>
-                <w:rFonts w:ascii="Cambria Math" w:hAnsi="Cambria Math"/>
-                <w:sz w:val="20"/>
-                <w:szCs w:val="20"/>
-              </w:rPr>
-            </m:ctrlPr>
-          </m:sSubPr>
-          <m:e>
-            <m:r>
-              <w:rPr>
-                <w:rFonts w:ascii="Cambria Math" w:hAnsi="Cambria Math"/>
-                <w:sz w:val="20"/>
-                <w:szCs w:val="20"/>
-              </w:rPr>
-              <m:t>η</m:t>
-            </m:r>
-          </m:e>
-          <m:sub>
-            <m:r>
-              <w:rPr>
-                <w:rFonts w:ascii="Cambria Math" w:hAnsi="Cambria Math"/>
-                <w:sz w:val="20"/>
-                <w:szCs w:val="20"/>
-              </w:rPr>
-              <m:t>E</m:t>
-            </m:r>
-          </m:sub>
-        </m:sSub>
-        <m:sSub>
-          <m:sSubPr>
-            <m:ctrlPr>
-              <w:rPr>
-                <w:rFonts w:ascii="Cambria Math" w:hAnsi="Cambria Math"/>
-                <w:sz w:val="20"/>
-                <w:szCs w:val="20"/>
-              </w:rPr>
-            </m:ctrlPr>
-          </m:sSubPr>
-          <m:e>
-            <m:r>
-              <w:rPr>
-                <w:rFonts w:ascii="Cambria Math" w:hAnsi="Cambria Math"/>
-                <w:sz w:val="20"/>
-                <w:szCs w:val="20"/>
-              </w:rPr>
-              <m:t>W</m:t>
-            </m:r>
-          </m:e>
-          <m:sub>
-            <m:r>
-              <w:rPr>
-                <w:rFonts w:ascii="Cambria Math" w:hAnsi="Cambria Math"/>
-                <w:sz w:val="20"/>
-                <w:szCs w:val="20"/>
-              </w:rPr>
-              <m:t>E</m:t>
-            </m:r>
-            <m:r>
-              <m:rPr>
-                <m:sty m:val="p"/>
-              </m:rPr>
-              <w:rPr>
-                <w:rFonts w:ascii="Cambria Math" w:hAnsi="Cambria Math"/>
-                <w:sz w:val="20"/>
-                <w:szCs w:val="20"/>
-              </w:rPr>
-              <m:t>,</m:t>
-            </m:r>
-            <m:r>
-              <w:rPr>
-                <w:rFonts w:ascii="Cambria Math" w:hAnsi="Cambria Math"/>
-                <w:sz w:val="20"/>
-                <w:szCs w:val="20"/>
-              </w:rPr>
-              <m:t>is</m:t>
-            </m:r>
-          </m:sub>
-        </m:sSub>
-      </m:oMath>
-      <w:r>
-        <w:rPr>
-          <w:sz w:val="20"/>
-          <w:szCs w:val="20"/>
-        </w:rPr>
-        <w:t> and </w:t>
-      </w:r>
-      <m:oMath>
-        <m:sSub>
-          <m:sSubPr>
-            <m:ctrlPr>
-              <w:rPr>
-                <w:rFonts w:ascii="Cambria Math" w:hAnsi="Cambria Math"/>
-                <w:sz w:val="20"/>
-                <w:szCs w:val="20"/>
-              </w:rPr>
-            </m:ctrlPr>
-          </m:sSubPr>
-          <m:e>
-            <m:r>
-              <w:rPr>
-                <w:rFonts w:ascii="Cambria Math" w:hAnsi="Cambria Math"/>
-                <w:sz w:val="20"/>
-                <w:szCs w:val="20"/>
-              </w:rPr>
-              <m:t>W</m:t>
-            </m:r>
-          </m:e>
-          <m:sub>
-            <m:r>
-              <w:rPr>
-                <w:rFonts w:ascii="Cambria Math" w:hAnsi="Cambria Math"/>
-                <w:sz w:val="20"/>
-                <w:szCs w:val="20"/>
-              </w:rPr>
-              <m:t>C</m:t>
-            </m:r>
-            <m:r>
-              <m:rPr>
-                <m:sty m:val="p"/>
-              </m:rPr>
-              <w:rPr>
-                <w:rFonts w:ascii="Cambria Math" w:hAnsi="Cambria Math"/>
-                <w:sz w:val="20"/>
-                <w:szCs w:val="20"/>
-              </w:rPr>
-              <m:t>,</m:t>
-            </m:r>
-            <m:r>
-              <w:rPr>
-                <w:rFonts w:ascii="Cambria Math" w:hAnsi="Cambria Math"/>
-                <w:sz w:val="20"/>
-                <w:szCs w:val="20"/>
-              </w:rPr>
-              <m:t>real</m:t>
-            </m:r>
-          </m:sub>
-        </m:sSub>
-        <m:r>
-          <m:rPr>
-            <m:sty m:val="p"/>
-          </m:rPr>
-          <w:rPr>
-            <w:rFonts w:ascii="Cambria Math" w:hAnsi="Cambria Math"/>
-            <w:sz w:val="20"/>
-            <w:szCs w:val="20"/>
-          </w:rPr>
-          <m:t>=</m:t>
-        </m:r>
-        <m:sSub>
-          <m:sSubPr>
-            <m:ctrlPr>
-              <w:rPr>
-                <w:rFonts w:ascii="Cambria Math" w:hAnsi="Cambria Math"/>
-                <w:sz w:val="20"/>
-                <w:szCs w:val="20"/>
-              </w:rPr>
-            </m:ctrlPr>
-          </m:sSubPr>
-          <m:e>
-            <m:r>
-              <w:rPr>
-                <w:rFonts w:ascii="Cambria Math" w:hAnsi="Cambria Math"/>
-                <w:sz w:val="20"/>
-                <w:szCs w:val="20"/>
-              </w:rPr>
-              <m:t>W</m:t>
-            </m:r>
-          </m:e>
-          <m:sub>
-            <m:r>
-              <w:rPr>
-                <w:rFonts w:ascii="Cambria Math" w:hAnsi="Cambria Math"/>
-                <w:sz w:val="20"/>
-                <w:szCs w:val="20"/>
-              </w:rPr>
-              <m:t>C</m:t>
-            </m:r>
-            <m:r>
-              <m:rPr>
-                <m:sty m:val="p"/>
-              </m:rPr>
-              <w:rPr>
-                <w:rFonts w:ascii="Cambria Math" w:hAnsi="Cambria Math"/>
-                <w:sz w:val="20"/>
-                <w:szCs w:val="20"/>
-              </w:rPr>
-              <m:t>,</m:t>
-            </m:r>
-            <m:r>
-              <w:rPr>
-                <w:rFonts w:ascii="Cambria Math" w:hAnsi="Cambria Math"/>
-                <w:sz w:val="20"/>
-                <w:szCs w:val="20"/>
-              </w:rPr>
-              <m:t>is</m:t>
-            </m:r>
-          </m:sub>
-        </m:sSub>
-        <m:r>
-          <m:rPr>
-            <m:sty m:val="p"/>
-          </m:rPr>
-          <w:rPr>
-            <w:rFonts w:ascii="Cambria Math" w:hAnsi="Cambria Math"/>
-            <w:sz w:val="20"/>
-            <w:szCs w:val="20"/>
-          </w:rPr>
-          <m:t>/</m:t>
-        </m:r>
-        <m:sSub>
-          <m:sSubPr>
-            <m:ctrlPr>
-              <w:rPr>
-                <w:rFonts w:ascii="Cambria Math" w:hAnsi="Cambria Math"/>
-                <w:sz w:val="20"/>
-                <w:szCs w:val="20"/>
-              </w:rPr>
-            </m:ctrlPr>
-          </m:sSubPr>
-          <m:e>
-            <m:r>
-              <w:rPr>
-                <w:rFonts w:ascii="Cambria Math" w:hAnsi="Cambria Math"/>
-                <w:sz w:val="20"/>
-                <w:szCs w:val="20"/>
-              </w:rPr>
-              <m:t>η</m:t>
-            </m:r>
-          </m:e>
-          <m:sub>
-            <m:r>
-              <w:rPr>
-                <w:rFonts w:ascii="Cambria Math" w:hAnsi="Cambria Math"/>
-                <w:sz w:val="20"/>
-                <w:szCs w:val="20"/>
-              </w:rPr>
-              <m:t>C</m:t>
-            </m:r>
-          </m:sub>
-        </m:sSub>
-      </m:oMath>
-      <w:r>
-        <w:rPr>
-          <w:sz w:val="20"/>
-          <w:szCs w:val="20"/>
-        </w:rPr>
-        <w:t>. A simplified value of </w:t>
-      </w:r>
-      <m:oMath>
-        <m:sSub>
-          <m:sSubPr>
-            <m:ctrlPr>
-              <w:rPr>
-                <w:rFonts w:ascii="Cambria Math" w:hAnsi="Cambria Math"/>
-                <w:sz w:val="20"/>
-                <w:szCs w:val="20"/>
-              </w:rPr>
-            </m:ctrlPr>
-          </m:sSubPr>
-          <m:e>
-            <m:r>
-              <w:rPr>
-                <w:rFonts w:ascii="Cambria Math" w:hAnsi="Cambria Math"/>
-                <w:sz w:val="20"/>
-                <w:szCs w:val="20"/>
-              </w:rPr>
-              <m:t>η</m:t>
-            </m:r>
-          </m:e>
-          <m:sub>
-            <m:r>
-              <w:rPr>
-                <w:rFonts w:ascii="Cambria Math" w:hAnsi="Cambria Math"/>
-                <w:sz w:val="20"/>
-                <w:szCs w:val="20"/>
-              </w:rPr>
-              <m:t>E</m:t>
-            </m:r>
-          </m:sub>
-        </m:sSub>
-        <m:r>
-          <m:rPr>
-            <m:sty m:val="p"/>
-          </m:rPr>
-          <w:rPr>
-            <w:rFonts w:ascii="Cambria Math" w:hAnsi="Cambria Math"/>
-            <w:sz w:val="20"/>
-            <w:szCs w:val="20"/>
-          </w:rPr>
-          <m:t>=</m:t>
-        </m:r>
-        <m:sSub>
-          <m:sSubPr>
-            <m:ctrlPr>
-              <w:rPr>
-                <w:rFonts w:ascii="Cambria Math" w:hAnsi="Cambria Math"/>
-                <w:sz w:val="20"/>
-                <w:szCs w:val="20"/>
-              </w:rPr>
-            </m:ctrlPr>
-          </m:sSubPr>
-          <m:e>
-            <m:r>
-              <w:rPr>
-                <w:rFonts w:ascii="Cambria Math" w:hAnsi="Cambria Math"/>
-                <w:sz w:val="20"/>
-                <w:szCs w:val="20"/>
-              </w:rPr>
-              <m:t>η</m:t>
-            </m:r>
-          </m:e>
-          <m:sub>
-            <m:r>
-              <w:rPr>
-                <w:rFonts w:ascii="Cambria Math" w:hAnsi="Cambria Math"/>
-                <w:sz w:val="20"/>
-                <w:szCs w:val="20"/>
-              </w:rPr>
-              <m:t>C</m:t>
-            </m:r>
-          </m:sub>
-        </m:sSub>
-        <m:r>
-          <m:rPr>
-            <m:sty m:val="p"/>
-          </m:rPr>
-          <w:rPr>
-            <w:rFonts w:ascii="Cambria Math" w:hAnsi="Cambria Math"/>
-            <w:sz w:val="20"/>
-            <w:szCs w:val="20"/>
-          </w:rPr>
-          <m:t>=0.85</m:t>
-        </m:r>
-      </m:oMath>
-      <w:r>
-        <w:rPr>
-          <w:sz w:val="20"/>
-          <w:szCs w:val="20"/>
-        </w:rPr>
-        <w:t> was assumed for both expansion and compression. The resulting net pressure-work balance was defined as </w:t>
-      </w:r>
-      <m:oMath>
-        <m:r>
-          <m:rPr>
-            <m:sty m:val="p"/>
-          </m:rPr>
-          <w:rPr>
-            <w:rFonts w:ascii="Cambria Math" w:hAnsi="Cambria Math"/>
-            <w:sz w:val="20"/>
-            <w:szCs w:val="20"/>
-          </w:rPr>
-          <m:t>Δ</m:t>
-        </m:r>
-        <m:sSub>
-          <m:sSubPr>
-            <m:ctrlPr>
-              <w:rPr>
-                <w:rFonts w:ascii="Cambria Math" w:hAnsi="Cambria Math"/>
-                <w:sz w:val="20"/>
-                <w:szCs w:val="20"/>
-              </w:rPr>
-            </m:ctrlPr>
-          </m:sSubPr>
-          <m:e>
-            <m:r>
-              <w:rPr>
-                <w:rFonts w:ascii="Cambria Math" w:hAnsi="Cambria Math"/>
-                <w:sz w:val="20"/>
-                <w:szCs w:val="20"/>
-              </w:rPr>
-              <m:t>W</m:t>
-            </m:r>
-          </m:e>
-          <m:sub>
-            <m:r>
-              <w:rPr>
-                <w:rFonts w:ascii="Cambria Math" w:hAnsi="Cambria Math"/>
-                <w:sz w:val="20"/>
-                <w:szCs w:val="20"/>
-              </w:rPr>
-              <m:t>E</m:t>
-            </m:r>
-            <m:r>
-              <m:rPr>
-                <m:sty m:val="p"/>
-              </m:rPr>
-              <w:rPr>
-                <w:rFonts w:ascii="Cambria Math" w:hAnsi="Cambria Math"/>
-                <w:sz w:val="20"/>
-                <w:szCs w:val="20"/>
-              </w:rPr>
-              <m:t>-</m:t>
-            </m:r>
-            <m:r>
-              <w:rPr>
-                <w:rFonts w:ascii="Cambria Math" w:hAnsi="Cambria Math"/>
-                <w:sz w:val="20"/>
-                <w:szCs w:val="20"/>
-              </w:rPr>
-              <m:t>C</m:t>
-            </m:r>
-          </m:sub>
-        </m:sSub>
-        <m:r>
-          <m:rPr>
-            <m:sty m:val="p"/>
-          </m:rPr>
-          <w:rPr>
-            <w:rFonts w:ascii="Cambria Math" w:hAnsi="Cambria Math"/>
-            <w:sz w:val="20"/>
-            <w:szCs w:val="20"/>
-          </w:rPr>
-          <m:t>=</m:t>
-        </m:r>
-        <m:sSub>
-          <m:sSubPr>
-            <m:ctrlPr>
-              <w:rPr>
-                <w:rFonts w:ascii="Cambria Math" w:hAnsi="Cambria Math"/>
-                <w:sz w:val="20"/>
-                <w:szCs w:val="20"/>
-              </w:rPr>
-            </m:ctrlPr>
-          </m:sSubPr>
-          <m:e>
-            <m:r>
-              <w:rPr>
-                <w:rFonts w:ascii="Cambria Math" w:hAnsi="Cambria Math"/>
-                <w:sz w:val="20"/>
-                <w:szCs w:val="20"/>
-              </w:rPr>
-              <m:t>W</m:t>
-            </m:r>
-          </m:e>
-          <m:sub>
-            <m:r>
-              <w:rPr>
-                <w:rFonts w:ascii="Cambria Math" w:hAnsi="Cambria Math"/>
-                <w:sz w:val="20"/>
-                <w:szCs w:val="20"/>
-              </w:rPr>
-              <m:t>E</m:t>
-            </m:r>
-          </m:sub>
-        </m:sSub>
-        <m:r>
-          <m:rPr>
-            <m:sty m:val="p"/>
-          </m:rPr>
-          <w:rPr>
-            <w:rFonts w:ascii="Cambria Math" w:hAnsi="Cambria Math"/>
-            <w:sz w:val="20"/>
-            <w:szCs w:val="20"/>
-          </w:rPr>
-          <m:t>-</m:t>
-        </m:r>
-        <m:sSub>
-          <m:sSubPr>
-            <m:ctrlPr>
-              <w:rPr>
-                <w:rFonts w:ascii="Cambria Math" w:hAnsi="Cambria Math"/>
-                <w:sz w:val="20"/>
-                <w:szCs w:val="20"/>
-              </w:rPr>
-            </m:ctrlPr>
-          </m:sSubPr>
-          <m:e>
-            <m:r>
-              <w:rPr>
-                <w:rFonts w:ascii="Cambria Math" w:hAnsi="Cambria Math"/>
-                <w:sz w:val="20"/>
-                <w:szCs w:val="20"/>
-              </w:rPr>
-              <m:t>W</m:t>
-            </m:r>
-          </m:e>
-          <m:sub>
-            <m:r>
-              <w:rPr>
-                <w:rFonts w:ascii="Cambria Math" w:hAnsi="Cambria Math"/>
-                <w:sz w:val="20"/>
-                <w:szCs w:val="20"/>
-              </w:rPr>
-              <m:t>C</m:t>
-            </m:r>
-          </m:sub>
-        </m:sSub>
-      </m:oMath>
-      <w:r>
-        <w:rPr>
-          <w:sz w:val="20"/>
-          <w:szCs w:val="20"/>
-        </w:rPr>
-        <w:t>, where negative values indicate that the avoided downstream hydrogen recompression demand exceeds the recoverable expansion work from natural</w:t>
-      </w:r>
-      <w:r>
-        <w:rPr>
-          <w:sz w:val="20"/>
-          <w:szCs w:val="20"/>
-        </w:rPr>
-        <w:t xml:space="preserve"> </w:t>
-      </w:r>
-      <w:r>
-        <w:rPr>
-          <w:sz w:val="20"/>
-          <w:szCs w:val="20"/>
-        </w:rPr>
-        <w:t xml:space="preserve">gas pressure reduction. All energy terms were finally </w:t>
-      </w:r>
-      <w:r>
-        <w:rPr>
-          <w:sz w:val="20"/>
-          <w:szCs w:val="20"/>
-        </w:rPr>
-        <w:t xml:space="preserve">converted to primary energy and </w:t>
-      </w:r>
-      <w:r>
-        <w:rPr>
-          <w:sz w:val="20"/>
-          <w:szCs w:val="20"/>
-        </w:rPr>
-        <w:t>normalized to the natural</w:t>
-      </w:r>
-      <w:r>
-        <w:rPr>
-          <w:sz w:val="20"/>
-          <w:szCs w:val="20"/>
-        </w:rPr>
-        <w:t xml:space="preserve"> </w:t>
-      </w:r>
-      <w:r>
-        <w:rPr>
-          <w:sz w:val="20"/>
-          <w:szCs w:val="20"/>
-        </w:rPr>
-        <w:t>gas feedstock energy</w:t>
-      </w:r>
-      <w:r>
-        <w:rPr>
-          <w:sz w:val="20"/>
-          <w:szCs w:val="20"/>
-        </w:rPr>
-        <w:t xml:space="preserve"> analog to above</w:t>
-      </w:r>
-      <w:r>
-        <w:rPr>
-          <w:sz w:val="20"/>
-          <w:szCs w:val="20"/>
-        </w:rPr>
-        <w:t>.</w:t>
-      </w:r>
-    </w:p>
-    <w:p>
-      <w:pPr>
-        <w:rPr>
-          <w:sz w:val="20"/>
-          <w:szCs w:val="20"/>
-        </w:rPr>
-      </w:pPr>
-    </w:p>
-    <w:p>
-      <w:pPr>
-        <w:rPr>
-          <w:sz w:val="20"/>
-          <w:szCs w:val="20"/>
-        </w:rPr>
-      </w:pPr>
-      <w:r>
-        <w:rPr>
-          <w:sz w:val="20"/>
-          <w:szCs w:val="20"/>
-        </w:rPr>
-        <w:t xml:space="preserve">To assess the decarbonization potential of the eSMR concept independently of regional energy price distortions, the abatement effectiveness </w:t>
-      </w:r>
-      <w:r>
-        <w:rPr>
-          <w:sz w:val="20"/>
-          <w:szCs w:val="20"/>
-        </w:rPr>
-        <w:t>–</w:t>
-      </w:r>
-      <w:r>
-        <w:rPr>
-          <w:sz w:val="20"/>
-          <w:szCs w:val="20"/>
-        </w:rPr>
-        <w:t xml:space="preserve"> defined as t CO₂ avoided per MWh of renewable electricity input </w:t>
-      </w:r>
-      <w:r>
-        <w:rPr>
-          <w:sz w:val="20"/>
-          <w:szCs w:val="20"/>
-        </w:rPr>
-        <w:t>–</w:t>
-      </w:r>
-      <w:r>
-        <w:rPr>
-          <w:sz w:val="20"/>
-          <w:szCs w:val="20"/>
-        </w:rPr>
-        <w:t xml:space="preserve"> was evaluated under theoretical upper-bound conditions. The metric was derived from the ratio of avoided NG-fired heating emissions to the electrical energy required to drive the reforming reaction</w:t>
-      </w:r>
-      <w:r>
-        <w:rPr>
-          <w:sz w:val="20"/>
-          <w:szCs w:val="20"/>
-        </w:rPr>
-        <w:t xml:space="preserve">. </w:t>
-      </w:r>
-      <w:r>
-        <w:rPr>
-          <w:sz w:val="20"/>
-          <w:szCs w:val="20"/>
-        </w:rPr>
-        <w:t>Since the eSMR concept eliminates the steam co-product through internal heat integration, the equivalent steam demand at integrated chemical sites must alternatively be supplied via electrified heat generation, contributing an additional abatement effectiveness</w:t>
-      </w:r>
-    </w:p>
-    <w:p>
-      <w:pPr>
-        <w:rPr>
-          <w:sz w:val="20"/>
-          <w:szCs w:val="20"/>
-        </w:rPr>
-      </w:pPr>
-      <w:r>
-        <w:rPr>
-          <w:sz w:val="20"/>
-          <w:szCs w:val="20"/>
-        </w:rPr>
-        <w:br w:type="page"/>
-      </w:r>
-    </w:p>
-    <w:p>
-      <w:pPr>
+        <w:t>Compari</w:t>
+      </w:r>
+      <w:r>
+        <w:rPr>
+          <w:sz w:val="20"/>
+          <w:szCs w:val="20"/>
+        </w:rPr>
+        <w:t>son of</w:t>
+      </w:r>
+      <w:r>
+        <w:rPr>
+          <w:sz w:val="20"/>
+          <w:szCs w:val="20"/>
+        </w:rPr>
+        <w:t xml:space="preserve"> the electrified SMR (eSMR) process with the conventional process at the block flow diagram level reveals that </w:t>
+      </w:r>
+      <w:r>
+        <w:rPr>
+          <w:sz w:val="20"/>
+          <w:szCs w:val="20"/>
+        </w:rPr>
+        <w:t>NG</w:t>
+      </w:r>
+      <w:r>
+        <w:rPr>
+          <w:sz w:val="20"/>
+          <w:szCs w:val="20"/>
+        </w:rPr>
+        <w:t xml:space="preserve"> energy is substituted by electrical energy, </w:t>
+      </w:r>
+      <w:r>
         <w:rPr>
           <w:b/>
           <w:bCs/>
           <w:sz w:val="20"/>
           <w:szCs w:val="20"/>
-          <w:u w:val="single"/>
-        </w:rPr>
-      </w:pPr>
+        </w:rPr>
+        <w:t xml:space="preserve">without </w:t>
+      </w:r>
+      <w:r>
+        <w:rPr>
+          <w:sz w:val="20"/>
+          <w:szCs w:val="20"/>
+        </w:rPr>
+        <w:t xml:space="preserve">a significant </w:t>
+      </w:r>
       <w:r>
         <w:rPr>
           <w:b/>
           <w:bCs/>
           <w:sz w:val="20"/>
           <w:szCs w:val="20"/>
-          <w:u w:val="single"/>
-        </w:rPr>
-        <w:lastRenderedPageBreak/>
-        <w:t>Comparison to Conventional SMR Process</w:t>
-      </w:r>
-    </w:p>
-    <w:p>
-      <w:pPr>
+        </w:rPr>
+        <w:t>reduction in overall energy consumption</w:t>
+      </w:r>
+      <w:r>
+        <w:rPr>
+          <w:sz w:val="20"/>
+          <w:szCs w:val="20"/>
+        </w:rPr>
+        <w:t>. Given that electricity prices are substantially higher than NG</w:t>
+      </w:r>
+      <w:r>
+        <w:rPr>
+          <w:sz w:val="20"/>
+          <w:szCs w:val="20"/>
+        </w:rPr>
+        <w:t xml:space="preserve"> </w:t>
+      </w:r>
+      <w:r>
+        <w:rPr>
+          <w:sz w:val="20"/>
+          <w:szCs w:val="20"/>
+        </w:rPr>
+        <w:t>prices,</w:t>
+      </w:r>
+      <w:r>
+        <w:rPr>
+          <w:rFonts w:ascii="Helvetica Neue" w:eastAsiaTheme="minorHAnsi" w:hAnsi="Helvetica Neue" w:cs="Helvetica Neue"/>
+          <w:color w:val="000000"/>
+          <w:sz w:val="22"/>
+          <w:szCs w:val="22"/>
+          <w:lang w:val="en-GB" w:eastAsia="en-US"/>
+          <w14:ligatures w14:val="standardContextual"/>
+        </w:rPr>
+        <w:t xml:space="preserve"> </w:t>
+      </w:r>
+      <w:r>
+        <w:rPr>
+          <w:sz w:val="20"/>
+          <w:szCs w:val="20"/>
+          <w:lang w:val="en-GB"/>
+        </w:rPr>
+        <w:t>t</w:t>
+      </w:r>
+      <w:r>
+        <w:rPr>
+          <w:sz w:val="20"/>
+          <w:szCs w:val="20"/>
+          <w:lang w:val="en-GB"/>
+        </w:rPr>
+        <w:t xml:space="preserve">he analysis suggests </w:t>
+      </w:r>
+      <w:r>
         <w:rPr>
           <w:b/>
           <w:bCs/>
           <w:sz w:val="20"/>
           <w:szCs w:val="20"/>
-          <w:u w:val="single"/>
-        </w:rPr>
-      </w:pPr>
-    </w:p>
-    <w:p>
-      <w:pPr>
-        <w:rPr>
-          <w:sz w:val="20"/>
-          <w:szCs w:val="20"/>
-        </w:rPr>
-      </w:pPr>
-      <w:r>
-        <w:rPr>
-          <w:sz w:val="20"/>
-          <w:szCs w:val="20"/>
-        </w:rPr>
-        <w:t>For SMR-based hydrogen production</w:t>
-      </w:r>
-      <w:r>
-        <w:rPr>
-          <w:sz w:val="20"/>
-          <w:szCs w:val="20"/>
-        </w:rPr>
-        <w:t xml:space="preserve"> from natural gas</w:t>
-      </w:r>
-      <w:r>
-        <w:rPr>
-          <w:sz w:val="20"/>
-          <w:szCs w:val="20"/>
-        </w:rPr>
-        <w:t xml:space="preserve"> (NG)</w:t>
-      </w:r>
-      <w:r>
-        <w:rPr>
-          <w:sz w:val="20"/>
-          <w:szCs w:val="20"/>
-        </w:rPr>
-        <w:t xml:space="preserve">, </w:t>
-      </w:r>
-      <w:r>
-        <w:rPr>
-          <w:b/>
-          <w:bCs/>
-          <w:sz w:val="20"/>
-          <w:szCs w:val="20"/>
-        </w:rPr>
-        <w:t>capital expenditures</w:t>
-      </w:r>
-      <w:r>
-        <w:rPr>
-          <w:sz w:val="20"/>
-          <w:szCs w:val="20"/>
-        </w:rPr>
-        <w:t xml:space="preserve"> (</w:t>
-      </w:r>
-      <w:r>
-        <w:rPr>
-          <w:sz w:val="20"/>
-          <w:szCs w:val="20"/>
-        </w:rPr>
-        <w:t>CAPEX</w:t>
-      </w:r>
-      <w:r>
-        <w:rPr>
-          <w:sz w:val="20"/>
-          <w:szCs w:val="20"/>
-        </w:rPr>
-        <w:t>)</w:t>
-      </w:r>
-      <w:r>
-        <w:rPr>
-          <w:sz w:val="20"/>
-          <w:szCs w:val="20"/>
-        </w:rPr>
-        <w:t xml:space="preserve"> is of </w:t>
-      </w:r>
-      <w:r>
-        <w:rPr>
-          <w:b/>
-          <w:bCs/>
-          <w:sz w:val="20"/>
-          <w:szCs w:val="20"/>
-        </w:rPr>
-        <w:t>secondary</w:t>
-      </w:r>
-      <w:r>
-        <w:rPr>
-          <w:sz w:val="20"/>
-          <w:szCs w:val="20"/>
-        </w:rPr>
-        <w:t xml:space="preserve"> </w:t>
-      </w:r>
-      <w:r>
-        <w:rPr>
-          <w:b/>
-          <w:bCs/>
-          <w:sz w:val="20"/>
-          <w:szCs w:val="20"/>
-        </w:rPr>
-        <w:t>importance</w:t>
-      </w:r>
-      <w:r>
-        <w:rPr>
-          <w:sz w:val="20"/>
-          <w:szCs w:val="20"/>
-        </w:rPr>
-        <w:t xml:space="preserve"> to economic viability, as </w:t>
-      </w:r>
-      <w:r>
-        <w:rPr>
-          <w:sz w:val="20"/>
-          <w:szCs w:val="20"/>
-        </w:rPr>
-        <w:t>operating expenditures (</w:t>
-      </w:r>
-      <w:r>
-        <w:rPr>
-          <w:sz w:val="20"/>
-          <w:szCs w:val="20"/>
-        </w:rPr>
-        <w:t>OPEX</w:t>
-      </w:r>
-      <w:r>
-        <w:rPr>
-          <w:sz w:val="20"/>
-          <w:szCs w:val="20"/>
-        </w:rPr>
-        <w:t>)</w:t>
-      </w:r>
-      <w:r>
-        <w:rPr>
-          <w:sz w:val="20"/>
-          <w:szCs w:val="20"/>
-        </w:rPr>
-        <w:t xml:space="preserve"> </w:t>
-      </w:r>
-      <w:r>
-        <w:rPr>
-          <w:sz w:val="20"/>
-          <w:szCs w:val="20"/>
-        </w:rPr>
-        <w:t>–</w:t>
-      </w:r>
-      <w:r>
-        <w:rPr>
-          <w:sz w:val="20"/>
-          <w:szCs w:val="20"/>
-        </w:rPr>
-        <w:t xml:space="preserve"> dominated by </w:t>
-      </w:r>
-      <w:r>
-        <w:rPr>
-          <w:b/>
-          <w:bCs/>
-          <w:sz w:val="20"/>
-          <w:szCs w:val="20"/>
-        </w:rPr>
-        <w:t>NG</w:t>
-      </w:r>
-      <w:r>
-        <w:rPr>
-          <w:b/>
-          <w:bCs/>
-          <w:sz w:val="20"/>
-          <w:szCs w:val="20"/>
-        </w:rPr>
-        <w:t xml:space="preserve"> feedstock costs</w:t>
-      </w:r>
-      <w:r>
-        <w:rPr>
-          <w:sz w:val="20"/>
-          <w:szCs w:val="20"/>
-        </w:rPr>
-        <w:t xml:space="preserve"> (45</w:t>
-      </w:r>
-      <w:r>
-        <w:rPr>
-          <w:sz w:val="20"/>
-          <w:szCs w:val="20"/>
-        </w:rPr>
-        <w:t>-</w:t>
-      </w:r>
-      <w:r>
-        <w:rPr>
-          <w:sz w:val="20"/>
-          <w:szCs w:val="20"/>
-        </w:rPr>
-        <w:t>75% of total production costs</w:t>
-      </w:r>
-      <w:r>
-        <w:rPr>
-          <w:sz w:val="20"/>
-          <w:szCs w:val="20"/>
-        </w:rPr>
-        <w:t xml:space="preserve"> [1]</w:t>
-      </w:r>
-      <w:r>
-        <w:rPr>
-          <w:sz w:val="20"/>
-          <w:szCs w:val="20"/>
-        </w:rPr>
-        <w:t xml:space="preserve">) </w:t>
-      </w:r>
-      <w:r>
-        <w:rPr>
-          <w:sz w:val="20"/>
-          <w:szCs w:val="20"/>
-        </w:rPr>
-        <w:t>–</w:t>
-      </w:r>
-      <w:r>
-        <w:rPr>
-          <w:sz w:val="20"/>
-          <w:szCs w:val="20"/>
-        </w:rPr>
-        <w:t xml:space="preserve"> constitutes the </w:t>
-      </w:r>
-      <w:r>
-        <w:rPr>
-          <w:b/>
-          <w:bCs/>
-          <w:sz w:val="20"/>
-          <w:szCs w:val="20"/>
-        </w:rPr>
-        <w:t>primary cost driver</w:t>
-      </w:r>
-      <w:r>
-        <w:rPr>
-          <w:sz w:val="20"/>
-          <w:szCs w:val="20"/>
-        </w:rPr>
-        <w:t xml:space="preserve">. Including CCUS, </w:t>
-      </w:r>
-      <w:r>
-        <w:rPr>
-          <w:sz w:val="20"/>
-          <w:szCs w:val="20"/>
-        </w:rPr>
-        <w:t>CAPEX</w:t>
-      </w:r>
-      <w:r>
-        <w:rPr>
-          <w:sz w:val="20"/>
-          <w:szCs w:val="20"/>
-        </w:rPr>
-        <w:t xml:space="preserve"> </w:t>
-      </w:r>
-      <w:r>
-        <w:rPr>
-          <w:sz w:val="20"/>
-          <w:szCs w:val="20"/>
-        </w:rPr>
-        <w:t xml:space="preserve">is between 25% in high-fuel-cost-regions like Europe or China and 40% in low-fuel-cost regions like </w:t>
-      </w:r>
-      <w:r>
-        <w:rPr>
-          <w:sz w:val="20"/>
-          <w:szCs w:val="20"/>
-        </w:rPr>
-        <w:t xml:space="preserve">Middle East or US [1]. Especially in Europe it can be as low as 7% according </w:t>
-      </w:r>
-      <w:r>
-        <w:rPr>
-          <w:sz w:val="20"/>
-          <w:szCs w:val="20"/>
-        </w:rPr>
-        <w:t xml:space="preserve">to </w:t>
-      </w:r>
-      <w:r>
-        <w:rPr>
-          <w:sz w:val="20"/>
-          <w:szCs w:val="20"/>
-        </w:rPr>
-        <w:t xml:space="preserve">other studies [2]. This highlights that </w:t>
-      </w:r>
-      <w:r>
-        <w:rPr>
-          <w:sz w:val="20"/>
-          <w:szCs w:val="20"/>
-        </w:rPr>
-        <w:t xml:space="preserve">the </w:t>
-      </w:r>
-      <w:r>
-        <w:rPr>
-          <w:sz w:val="20"/>
-          <w:szCs w:val="20"/>
-        </w:rPr>
-        <w:t xml:space="preserve">CAPEX share </w:t>
-      </w:r>
-      <w:r>
-        <w:rPr>
-          <w:sz w:val="20"/>
-          <w:szCs w:val="20"/>
-        </w:rPr>
-        <w:t>depends heavily on the</w:t>
-      </w:r>
-      <w:r>
-        <w:rPr>
-          <w:sz w:val="20"/>
-          <w:szCs w:val="20"/>
-        </w:rPr>
-        <w:t xml:space="preserve"> assumptions</w:t>
-      </w:r>
-      <w:r>
-        <w:rPr>
-          <w:sz w:val="20"/>
-          <w:szCs w:val="20"/>
-        </w:rPr>
-        <w:t xml:space="preserve"> made</w:t>
-      </w:r>
-      <w:r>
-        <w:rPr>
-          <w:sz w:val="20"/>
-          <w:szCs w:val="20"/>
-        </w:rPr>
-        <w:t>.</w:t>
-      </w:r>
-    </w:p>
-    <w:p>
-      <w:pPr>
-        <w:rPr>
-          <w:sz w:val="20"/>
-          <w:szCs w:val="20"/>
-        </w:rPr>
-      </w:pPr>
-      <w:r>
-        <w:rPr>
-          <w:sz w:val="20"/>
-          <w:szCs w:val="20"/>
-        </w:rPr>
-        <w:t xml:space="preserve">Consequently, for process configurations of similar plant topology, a block flow diagram </w:t>
-      </w:r>
-      <w:r>
-        <w:rPr>
-          <w:sz w:val="20"/>
-          <w:szCs w:val="20"/>
-        </w:rPr>
-        <w:t>l</w:t>
-      </w:r>
-      <w:r>
-        <w:rPr>
-          <w:sz w:val="20"/>
-          <w:szCs w:val="20"/>
-        </w:rPr>
-        <w:t>evel assessment is sufficient to draw first-order conclusions on economic competitiveness</w:t>
-      </w:r>
-      <w:r>
-        <w:rPr>
-          <w:sz w:val="20"/>
-          <w:szCs w:val="20"/>
-        </w:rPr>
-        <w:t xml:space="preserve">, </w:t>
-      </w:r>
-      <w:r>
-        <w:rPr>
-          <w:sz w:val="20"/>
-          <w:szCs w:val="20"/>
-        </w:rPr>
-        <w:t>since variations in equipment layout and capital intensity are unlikely to alter the fundamental dominance of OPEX.</w:t>
-      </w:r>
-    </w:p>
-    <w:p>
-      <w:pPr>
-        <w:rPr>
-          <w:sz w:val="20"/>
-          <w:szCs w:val="20"/>
-        </w:rPr>
-      </w:pPr>
-    </w:p>
-    <w:p>
-      <w:pPr>
-        <w:rPr>
-          <w:sz w:val="20"/>
-          <w:szCs w:val="20"/>
-        </w:rPr>
-      </w:pPr>
-      <w:r>
-        <w:rPr>
-          <w:sz w:val="20"/>
-          <w:szCs w:val="20"/>
-        </w:rPr>
-        <w:t>Compari</w:t>
-      </w:r>
-      <w:r>
-        <w:rPr>
-          <w:sz w:val="20"/>
-          <w:szCs w:val="20"/>
-        </w:rPr>
-        <w:t>son of</w:t>
-      </w:r>
-      <w:r>
-        <w:rPr>
-          <w:sz w:val="20"/>
-          <w:szCs w:val="20"/>
-        </w:rPr>
-        <w:t xml:space="preserve"> the electrified SMR (eSMR) process with the conventional process at the block flow diagram level reveals that </w:t>
-      </w:r>
-      <w:r>
-        <w:rPr>
-          <w:sz w:val="20"/>
-          <w:szCs w:val="20"/>
-        </w:rPr>
-        <w:t>NG</w:t>
-      </w:r>
-      <w:r>
-        <w:rPr>
-          <w:sz w:val="20"/>
-          <w:szCs w:val="20"/>
-        </w:rPr>
-        <w:t xml:space="preserve"> energy is substituted by electrical energy, </w:t>
-      </w:r>
-      <w:r>
-        <w:rPr>
-          <w:b/>
-          <w:bCs/>
-          <w:sz w:val="20"/>
-          <w:szCs w:val="20"/>
-        </w:rPr>
-        <w:t xml:space="preserve">without </w:t>
-      </w:r>
-      <w:r>
-        <w:rPr>
-          <w:sz w:val="20"/>
-          <w:szCs w:val="20"/>
-        </w:rPr>
-        <w:t xml:space="preserve">a significant </w:t>
-      </w:r>
-      <w:r>
-        <w:rPr>
-          <w:b/>
-          <w:bCs/>
-          <w:sz w:val="20"/>
-          <w:szCs w:val="20"/>
-        </w:rPr>
-        <w:t>reduction in overall energy consumption</w:t>
-      </w:r>
-      <w:r>
-        <w:rPr>
-          <w:sz w:val="20"/>
-          <w:szCs w:val="20"/>
-        </w:rPr>
-        <w:t>. Given that electricity prices are substantially higher than NG</w:t>
-      </w:r>
-      <w:r>
-        <w:rPr>
-          <w:sz w:val="20"/>
-          <w:szCs w:val="20"/>
-        </w:rPr>
-        <w:t xml:space="preserve"> </w:t>
-      </w:r>
-      <w:r>
-        <w:rPr>
-          <w:sz w:val="20"/>
-          <w:szCs w:val="20"/>
-        </w:rPr>
-        <w:t xml:space="preserve">prices, this substitution </w:t>
-      </w:r>
-      <w:r>
-        <w:rPr>
-          <w:sz w:val="20"/>
-          <w:szCs w:val="20"/>
-        </w:rPr>
-        <w:t>does</w:t>
-      </w:r>
-      <w:r>
-        <w:rPr>
-          <w:b/>
-          <w:bCs/>
-          <w:sz w:val="20"/>
-          <w:szCs w:val="20"/>
-        </w:rPr>
-        <w:t xml:space="preserve"> not yield an economically viable alternative</w:t>
-      </w:r>
-      <w:r>
-        <w:rPr>
-          <w:sz w:val="20"/>
-          <w:szCs w:val="20"/>
-        </w:rPr>
-        <w:t xml:space="preserve"> to the incumbent process.</w:t>
+          <w:lang w:val="en-GB"/>
+        </w:rPr>
+        <w:t xml:space="preserve">limited economic competitiveness </w:t>
+      </w:r>
+      <w:r>
+        <w:rPr>
+          <w:sz w:val="20"/>
+          <w:szCs w:val="20"/>
+          <w:lang w:val="en-GB"/>
+        </w:rPr>
+        <w:t>under the evaluated assumptions.</w:t>
       </w:r>
     </w:p>
     <w:p>
@@ -2525,7 +1289,37 @@
           <w:sz w:val="20"/>
           <w:szCs w:val="20"/>
         </w:rPr>
-        <w:t xml:space="preserve">, which is conventionally offset by NG-fired steam generation. From this perspective, whether steam is produced from NG directly or as a byproduct of the SMR process is equivalent, neglecting minor differences in conversion efficiency. The </w:t>
+        <w:t xml:space="preserve">, which is conventionally offset by NG-fired steam generation. From this perspective, whether steam is produced from NG directly or as a byproduct of the SMR process is equivalent, neglecting minor differences in conversion efficiency. </w:t>
+      </w:r>
+      <w:r>
+        <w:rPr>
+          <w:sz w:val="20"/>
+          <w:szCs w:val="20"/>
+          <w:lang w:val="en-GB"/>
+        </w:rPr>
+        <w:t>From a first-order energetic perspective</w:t>
+      </w:r>
+      <w:r>
+        <w:rPr>
+          <w:sz w:val="20"/>
+          <w:szCs w:val="20"/>
+          <w:lang w:val="en-GB"/>
+        </w:rPr>
+        <w:t xml:space="preserve">, </w:t>
+      </w:r>
+      <w:r>
+        <w:rPr>
+          <w:sz w:val="20"/>
+          <w:szCs w:val="20"/>
+        </w:rPr>
+        <w:t>t</w:t>
+      </w:r>
+      <w:r>
+        <w:rPr>
+          <w:sz w:val="20"/>
+          <w:szCs w:val="20"/>
+        </w:rPr>
+        <w:t xml:space="preserve">he </w:t>
       </w:r>
       <w:r>
         <w:rPr>
@@ -2566,7 +1360,7 @@
           <w:sz w:val="20"/>
           <w:szCs w:val="20"/>
         </w:rPr>
-        <w:t>no economic advantage is achieved</w:t>
+        <w:t>an economic advantage appears unlikely</w:t>
       </w:r>
       <w:r>
         <w:rPr>
@@ -5638,7 +4432,50 @@
           <w:sz w:val="20"/>
           <w:szCs w:val="20"/>
         </w:rPr>
-        <w:t xml:space="preserve"> the primary thermodynamic driver for capture efficiency. Below this threshold, chemical absorption is generally preferred, while physical absorption becomes more favorable at system pressures above ~50 bar. Only beyond this threshold do differing capture methods warrant consideration in a techno-economic comparison.</w:t>
+        <w:t xml:space="preserve"> the primary thermodynamic driver for capture efficiency. Below this threshold, chemical absorption is generally preferred, while physical absorption becomes more favorable at system pressures above ~50 bar</w:t>
+      </w:r>
+      <w:r>
+        <w:rPr>
+          <w:sz w:val="20"/>
+          <w:szCs w:val="20"/>
+        </w:rPr>
+        <w:t xml:space="preserve"> (</w:t>
+      </w:r>
+      <w:r>
+        <w:rPr>
+          <w:sz w:val="20"/>
+          <w:szCs w:val="20"/>
+        </w:rPr>
+        <w:t>in case</w:t>
+      </w:r>
+      <w:r>
+        <w:rPr>
+          <w:sz w:val="20"/>
+          <w:szCs w:val="20"/>
+        </w:rPr>
+        <w:t xml:space="preserve"> of 20% CO</w:t>
+      </w:r>
+      <w:r>
+        <w:rPr>
+          <w:sz w:val="20"/>
+          <w:szCs w:val="20"/>
+          <w:vertAlign w:val="subscript"/>
+        </w:rPr>
+        <w:t>2</w:t>
+      </w:r>
+      <w:r>
+        <w:rPr>
+          <w:sz w:val="20"/>
+          <w:szCs w:val="20"/>
+        </w:rPr>
+        <w:t xml:space="preserve"> content). </w:t>
+      </w:r>
+      <w:r>
+        <w:rPr>
+          <w:sz w:val="20"/>
+          <w:szCs w:val="20"/>
+        </w:rPr>
+        <w:t>Only beyond this threshold do differing capture methods warrant consideration in a techno-economic comparison.</w:t>
       </w:r>
     </w:p>
     <w:p>
@@ -12275,7 +11112,21 @@
           <w:sz w:val="20"/>
           <w:szCs w:val="20"/>
         </w:rPr>
-        <w:t>This analysis concludes that electrified SMR (eSMR) is unlikely to displace conventional SMR under current economic conditions. The fundamental barrier is the electricity-to-natural gas price differential, which cannot be offset by the environmental benefits of avoided combustion emissions at prevailing or near-term projected carbon prices.</w:t>
+        <w:t>This analysis concludes that electrified SMR (eSMR) is unlikely to displace conventional SMR under current economic conditions</w:t>
+      </w:r>
+      <w:r>
+        <w:rPr>
+          <w:sz w:val="20"/>
+          <w:szCs w:val="20"/>
+        </w:rPr>
+        <w:t xml:space="preserve"> and the assumptions made</w:t>
+      </w:r>
+      <w:r>
+        <w:rPr>
+          <w:sz w:val="20"/>
+          <w:szCs w:val="20"/>
+        </w:rPr>
+        <w:t>. The fundamental barrier is the electricity-to-natural gas price differential, which cannot be offset by the environmental benefits of avoided combustion emissions at prevailing or near-term projected carbon prices.</w:t>
       </w:r>
     </w:p>
     <w:p>
@@ -12393,7 +11244,82 @@
           <w:sz w:val="20"/>
           <w:szCs w:val="20"/>
         </w:rPr>
-        <w:t xml:space="preserve">An additional differentiator is the material-limited operating pressure of conventional SMR (~40 bar), whereas the OCMC-based eSMR concept is unconstrained in this regard. Given that natural gas is typically supplied at </w:t>
+        <w:t xml:space="preserve">An additional differentiator is the material-limited operating pressure of conventional SMR (~40 bar), whereas the </w:t>
+      </w:r>
+      <w:r>
+        <w:rPr>
+          <w:color w:val="EE0000"/>
+          <w:sz w:val="20"/>
+          <w:szCs w:val="20"/>
+        </w:rPr>
+        <w:t>OCMC-based eSMR concept is unconstrained</w:t>
+      </w:r>
+      <w:r>
+        <w:rPr>
+          <w:sz w:val="20"/>
+          <w:szCs w:val="20"/>
+        </w:rPr>
+        <w:t xml:space="preserve"> (Kommentar Daniel: </w:t>
+      </w:r>
+      <w:r>
+        <w:rPr>
+          <w:color w:val="EE0000"/>
+          <w:sz w:val="20"/>
+          <w:szCs w:val="20"/>
+          <w:lang w:val="en-GB"/>
+        </w:rPr>
+        <w:t xml:space="preserve">less constrained by conventional metallic tube creep limitations. </w:t>
+      </w:r>
+      <w:r>
+        <w:rPr>
+          <w:color w:val="EE0000"/>
+          <w:sz w:val="20"/>
+          <w:szCs w:val="20"/>
+          <w:lang w:val="de-DE"/>
+        </w:rPr>
+        <w:t xml:space="preserve">OCMC generell ist druckbegrenzt. Nur Gegenstrom "theoretisch" nicht. Praktisch aber schon durch </w:t>
+      </w:r>
+      <w:proofErr w:type="spellStart"/>
+      <w:r>
+        <w:rPr>
+          <w:color w:val="EE0000"/>
+          <w:sz w:val="20"/>
+          <w:szCs w:val="20"/>
+          <w:lang w:val="de-DE"/>
+        </w:rPr>
+        <w:t>dichtungsprobleme</w:t>
+      </w:r>
+      <w:proofErr w:type="spellEnd"/>
+      <w:r>
+        <w:rPr>
+          <w:color w:val="EE0000"/>
+          <w:sz w:val="20"/>
+          <w:szCs w:val="20"/>
+          <w:lang w:val="de-DE"/>
+        </w:rPr>
+        <w:t xml:space="preserve"> etc.</w:t>
+      </w:r>
+      <w:r>
+        <w:rPr>
+          <w:color w:val="EE0000"/>
+          <w:sz w:val="20"/>
+          <w:szCs w:val="20"/>
+        </w:rPr>
+        <w:t>)</w:t>
+      </w:r>
+      <w:r>
+        <w:rPr>
+          <w:sz w:val="20"/>
+          <w:szCs w:val="20"/>
+        </w:rPr>
+        <w:t xml:space="preserve"> </w:t>
+      </w:r>
+      <w:r>
+        <w:rPr>
+          <w:sz w:val="20"/>
+          <w:szCs w:val="20"/>
+        </w:rPr>
+        <w:t xml:space="preserve">in this regard. Given that natural gas is typically supplied at </w:t>
       </w:r>
       <w:r>
         <w:rPr>
@@ -12430,7 +11356,21 @@
           <w:sz w:val="20"/>
           <w:szCs w:val="20"/>
         </w:rPr>
-        <w:t>Taken together, these considerations suggest that ammonia syngas production represents a more promising near-term application for the OCMC reactor concept than hydrogen-only SMR. This assessment is motivated by three compounding factors:</w:t>
+        <w:t xml:space="preserve">Taken together, these considerations suggest that ammonia syngas production </w:t>
+      </w:r>
+      <w:r>
+        <w:rPr>
+          <w:sz w:val="20"/>
+          <w:szCs w:val="20"/>
+        </w:rPr>
+        <w:t xml:space="preserve">may </w:t>
+      </w:r>
+      <w:r>
+        <w:rPr>
+          <w:sz w:val="20"/>
+          <w:szCs w:val="20"/>
+        </w:rPr>
+        <w:t>represent a more promising near-term application for the OCMC reactor concept than hydrogen-only SMR. This assessment is motivated by three compounding factors:</w:t>
       </w:r>
       <w:r>
         <w:rPr>
@@ -12634,20 +11574,35 @@
           <w:szCs w:val="20"/>
         </w:rPr>
       </w:pPr>
+      <w:r>
+        <w:rPr>
+          <w:color w:val="EE0000"/>
+          <w:sz w:val="20"/>
+          <w:szCs w:val="20"/>
+        </w:rPr>
+        <w:br w:type="page"/>
+      </w:r>
     </w:p>
     <w:p>
       <w:pPr>
         <w:rPr>
-          <w:sz w:val="20"/>
-          <w:szCs w:val="20"/>
-        </w:rPr>
-      </w:pPr>
-      <w:r>
-        <w:rPr>
-          <w:sz w:val="20"/>
-          <w:szCs w:val="20"/>
-        </w:rPr>
-        <w:br w:type="page"/>
+          <w:b/>
+          <w:bCs/>
+          <w:sz w:val="20"/>
+          <w:szCs w:val="20"/>
+          <w:u w:val="single"/>
+        </w:rPr>
+      </w:pPr>
+      <w:r>
+        <w:rPr>
+          <w:b/>
+          <w:bCs/>
+          <w:sz w:val="20"/>
+          <w:szCs w:val="20"/>
+          <w:u w:val="single"/>
+        </w:rPr>
+        <w:lastRenderedPageBreak/>
+        <w:t>Methodology</w:t>
       </w:r>
     </w:p>
     <w:p>
@@ -12657,6 +11612,41 @@
           <w:szCs w:val="20"/>
         </w:rPr>
       </w:pPr>
+      <w:r>
+        <w:rPr>
+          <w:sz w:val="20"/>
+          <w:szCs w:val="20"/>
+        </w:rPr>
+        <w:t xml:space="preserve">The additional energy demand of conventional SMR relative to eSMR was decomposed into (i) feed preheating, and (ii) irrecoverable thermal losses in the firebox and radiant section </w:t>
+      </w:r>
+      <w:r>
+        <w:rPr>
+          <w:sz w:val="20"/>
+          <w:szCs w:val="20"/>
+        </w:rPr>
+        <w:t>–</w:t>
+      </w:r>
+      <w:r>
+        <w:rPr>
+          <w:sz w:val="20"/>
+          <w:szCs w:val="20"/>
+        </w:rPr>
+        <w:t xml:space="preserve"> comprising flue gas losses (6</w:t>
+      </w:r>
+      <w:r>
+        <w:rPr>
+          <w:sz w:val="20"/>
+          <w:szCs w:val="20"/>
+        </w:rPr>
+        <w:t>-</w:t>
+      </w:r>
+      <w:r>
+        <w:rPr>
+          <w:sz w:val="20"/>
+          <w:szCs w:val="20"/>
+        </w:rPr>
+        <w:t>10%) and insulation losses (1–5% of fired energy) [Ullmann's]. Under ideal heat integration, contribution (i) is fully recovered as steam export, rendering it economically equivalent to dedicated NG-fired steam generation at sites operating under a net steam deficit. The net differentiator therefore reduces to the irrecoverable thermal losses of conventional SMR.</w:t>
+      </w:r>
     </w:p>
     <w:p>
       <w:pPr>
@@ -12670,6 +11660,663 @@
           <w:sz w:val="20"/>
           <w:szCs w:val="20"/>
         </w:rPr>
+        <w:t>The electricity-to-</w:t>
+      </w:r>
+      <w:r>
+        <w:rPr>
+          <w:sz w:val="20"/>
+          <w:szCs w:val="20"/>
+        </w:rPr>
+        <w:t xml:space="preserve">NG </w:t>
+      </w:r>
+      <w:r>
+        <w:rPr>
+          <w:sz w:val="20"/>
+          <w:szCs w:val="20"/>
+        </w:rPr>
+        <w:t xml:space="preserve">price ratio was evaluated for Germany, the United States, and China using 2019 industrial energy prices as a pre-crisis baseline, accounting for the fact that the reaction enthalpy </w:t>
+      </w:r>
+      <w:r>
+        <w:rPr>
+          <w:sz w:val="20"/>
+          <w:szCs w:val="20"/>
+        </w:rPr>
+        <w:t>–</w:t>
+      </w:r>
+      <w:r>
+        <w:rPr>
+          <w:sz w:val="20"/>
+          <w:szCs w:val="20"/>
+        </w:rPr>
+        <w:t xml:space="preserve"> near-identical in both processes </w:t>
+      </w:r>
+      <w:r>
+        <w:rPr>
+          <w:sz w:val="20"/>
+          <w:szCs w:val="20"/>
+        </w:rPr>
+        <w:t>–</w:t>
+      </w:r>
+      <w:r>
+        <w:rPr>
+          <w:sz w:val="20"/>
+          <w:szCs w:val="20"/>
+        </w:rPr>
+        <w:t xml:space="preserve"> is supplied by different energy carriers: natural gas in conventional SMR and electricity in eSMR. The CO₂ certificate price required to close the residual economic gap was then derived analytically using </w:t>
+      </w:r>
+      <w:r>
+        <w:rPr>
+          <w:sz w:val="20"/>
+          <w:szCs w:val="20"/>
+        </w:rPr>
+        <w:t>a</w:t>
+      </w:r>
+      <w:r>
+        <w:rPr>
+          <w:sz w:val="20"/>
+          <w:szCs w:val="20"/>
+        </w:rPr>
+        <w:t xml:space="preserve"> natural gas emission facto</w:t>
+      </w:r>
+      <w:r>
+        <w:rPr>
+          <w:sz w:val="20"/>
+          <w:szCs w:val="20"/>
+        </w:rPr>
+        <w:t>r.</w:t>
+      </w:r>
+    </w:p>
+    <w:p>
+      <w:pPr>
+        <w:rPr>
+          <w:sz w:val="20"/>
+          <w:szCs w:val="20"/>
+        </w:rPr>
+      </w:pPr>
+      <w:r>
+        <w:rPr>
+          <w:sz w:val="20"/>
+          <w:szCs w:val="20"/>
+        </w:rPr>
+        <w:t>This threshold was compared against current EU ETS carbon price levels to assess whether CO₂ pricing materially alters the conclusions.</w:t>
+      </w:r>
+    </w:p>
+    <w:p>
+      <w:pPr>
+        <w:rPr>
+          <w:sz w:val="20"/>
+          <w:szCs w:val="20"/>
+        </w:rPr>
+      </w:pPr>
+    </w:p>
+    <w:p>
+      <w:pPr>
+        <w:rPr>
+          <w:sz w:val="20"/>
+          <w:szCs w:val="20"/>
+        </w:rPr>
+      </w:pPr>
+      <w:r>
+        <w:rPr>
+          <w:sz w:val="20"/>
+          <w:szCs w:val="20"/>
+        </w:rPr>
+        <w:t>The additional energy demand of post-combustion CO₂ capture relative to pre-combustion capture was derived from the techno-economic simulation results reported by IEAGHG (2017) for an SMR-based merchant hydrogen plant. Two energy components were quantified separately: the thermal energy required for solvent regeneration in the stripper reboiler, and the electrical energy consumed by the capture and compression units, including auxiliary loads. The reboiler duty was calculated directly from the reported LP steam consumption of the CO₂ capture plant (64.4 t/h for pre-combustion MDEA, 96.4 t/h for post-combustion MEA) multiplied by the specific enthalpy difference between LP steam (0.44 MPa, 177 °C; h ≈ 2810 kJ/kg) and saturated condensate return (0.44 MPa, 147 °C; h ≈ 620 kJ/kg) from NIST steam tables</w:t>
+      </w:r>
+      <w:r>
+        <w:rPr>
+          <w:sz w:val="20"/>
+          <w:szCs w:val="20"/>
+        </w:rPr>
+        <w:t xml:space="preserve">. </w:t>
+      </w:r>
+      <w:r>
+        <w:rPr>
+          <w:sz w:val="20"/>
+          <w:szCs w:val="20"/>
+        </w:rPr>
+        <w:t>The electrical penalty was determined as the sum of differential power consumption of the hydrogen plant, COGEN auxiliaries/BoP, CO₂ capture plant, and CO₂ compression and drying unit, taken directly from the simulation results. Both energy components were normalized to the natural gas feedstock energy input (LHV basis) to enable transferability to other applications. To express both energy forms on a common primary-energy basis, the reboiler heat was divided by a boiler efficiency to account for the additional fuel required in a standalone installation, while the electrical demand was converted to primary energy using a factor of 2.5, corresponding to an average grid generation efficiency of approximately 40%. The incremental energy penalty of post-combustion over pre-combustion capture is reported as the sum of both contributions, expressed as a fraction of the natural gas feedstock energy</w:t>
+      </w:r>
+      <w:r>
+        <w:rPr>
+          <w:sz w:val="20"/>
+          <w:szCs w:val="20"/>
+        </w:rPr>
+        <w:t xml:space="preserve"> input on an LHV basis to allow comparison across applications</w:t>
+      </w:r>
+      <w:r>
+        <w:rPr>
+          <w:sz w:val="20"/>
+          <w:szCs w:val="20"/>
+        </w:rPr>
+        <w:t>.</w:t>
+      </w:r>
+    </w:p>
+    <w:p>
+      <w:pPr>
+        <w:rPr>
+          <w:sz w:val="20"/>
+          <w:szCs w:val="20"/>
+        </w:rPr>
+      </w:pPr>
+    </w:p>
+    <w:p>
+      <w:pPr>
+        <w:rPr>
+          <w:sz w:val="20"/>
+          <w:szCs w:val="20"/>
+        </w:rPr>
+      </w:pPr>
+      <w:r>
+        <w:rPr>
+          <w:sz w:val="20"/>
+          <w:szCs w:val="20"/>
+        </w:rPr>
+        <w:t>The energetic effect of high-pressure operation was assessed by comparing the pressure work associated with conventional pressure reduction of the natural</w:t>
+      </w:r>
+      <w:r>
+        <w:rPr>
+          <w:sz w:val="20"/>
+          <w:szCs w:val="20"/>
+        </w:rPr>
+        <w:t xml:space="preserve"> </w:t>
+      </w:r>
+      <w:r>
+        <w:rPr>
+          <w:sz w:val="20"/>
+          <w:szCs w:val="20"/>
+        </w:rPr>
+        <w:t>gas feed and subsequent recompression of the hydrogen product. Both steps were treated as ideal-gas, isentropic processes corrected by representative isentropic machine efficiencies. The isentropic exponents were calculated from temperature-dependent heat capacities, using </w:t>
+      </w:r>
+      <m:oMath>
+        <m:sSub>
+          <m:sSubPr>
+            <m:ctrlPr>
+              <w:rPr>
+                <w:rFonts w:ascii="Cambria Math" w:hAnsi="Cambria Math"/>
+                <w:sz w:val="20"/>
+                <w:szCs w:val="20"/>
+              </w:rPr>
+            </m:ctrlPr>
+          </m:sSubPr>
+          <m:e>
+            <m:r>
+              <w:rPr>
+                <w:rFonts w:ascii="Cambria Math" w:hAnsi="Cambria Math"/>
+                <w:sz w:val="20"/>
+                <w:szCs w:val="20"/>
+              </w:rPr>
+              <m:t>c</m:t>
+            </m:r>
+          </m:e>
+          <m:sub>
+            <m:r>
+              <w:rPr>
+                <w:rFonts w:ascii="Cambria Math" w:hAnsi="Cambria Math"/>
+                <w:sz w:val="20"/>
+                <w:szCs w:val="20"/>
+              </w:rPr>
+              <m:t>p</m:t>
+            </m:r>
+          </m:sub>
+        </m:sSub>
+      </m:oMath>
+      <w:r>
+        <w:rPr>
+          <w:sz w:val="20"/>
+          <w:szCs w:val="20"/>
+        </w:rPr>
+        <w:t> values for methane and hydrogen at the selected reference temperature. The recoverable expansion work of the natural</w:t>
+      </w:r>
+      <w:r>
+        <w:rPr>
+          <w:sz w:val="20"/>
+          <w:szCs w:val="20"/>
+        </w:rPr>
+        <w:t xml:space="preserve"> </w:t>
+      </w:r>
+      <w:r>
+        <w:rPr>
+          <w:sz w:val="20"/>
+          <w:szCs w:val="20"/>
+        </w:rPr>
+        <w:t xml:space="preserve">gas stream and the required hydrogen compression work were calculated from the molar-flow-based isentropic work expressions, with real-machine </w:t>
+      </w:r>
+      <w:r>
+        <w:rPr>
+          <w:sz w:val="20"/>
+          <w:szCs w:val="20"/>
+        </w:rPr>
+        <w:t xml:space="preserve">efficiencies. </w:t>
+      </w:r>
+      <w:r>
+        <w:rPr>
+          <w:sz w:val="20"/>
+          <w:szCs w:val="20"/>
+        </w:rPr>
+        <w:t>A simplified value of </w:t>
+      </w:r>
+      <m:oMath>
+        <m:sSub>
+          <m:sSubPr>
+            <m:ctrlPr>
+              <w:rPr>
+                <w:rFonts w:ascii="Cambria Math" w:hAnsi="Cambria Math"/>
+                <w:sz w:val="20"/>
+                <w:szCs w:val="20"/>
+              </w:rPr>
+            </m:ctrlPr>
+          </m:sSubPr>
+          <m:e>
+            <m:r>
+              <w:rPr>
+                <w:rFonts w:ascii="Cambria Math" w:hAnsi="Cambria Math"/>
+                <w:sz w:val="20"/>
+                <w:szCs w:val="20"/>
+              </w:rPr>
+              <m:t>η</m:t>
+            </m:r>
+          </m:e>
+          <m:sub>
+            <m:r>
+              <w:rPr>
+                <w:rFonts w:ascii="Cambria Math" w:hAnsi="Cambria Math"/>
+                <w:sz w:val="20"/>
+                <w:szCs w:val="20"/>
+              </w:rPr>
+              <m:t>E</m:t>
+            </m:r>
+          </m:sub>
+        </m:sSub>
+        <m:r>
+          <m:rPr>
+            <m:sty m:val="p"/>
+          </m:rPr>
+          <w:rPr>
+            <w:rFonts w:ascii="Cambria Math" w:hAnsi="Cambria Math"/>
+            <w:sz w:val="20"/>
+            <w:szCs w:val="20"/>
+          </w:rPr>
+          <m:t>=</m:t>
+        </m:r>
+        <m:sSub>
+          <m:sSubPr>
+            <m:ctrlPr>
+              <w:rPr>
+                <w:rFonts w:ascii="Cambria Math" w:hAnsi="Cambria Math"/>
+                <w:sz w:val="20"/>
+                <w:szCs w:val="20"/>
+              </w:rPr>
+            </m:ctrlPr>
+          </m:sSubPr>
+          <m:e>
+            <m:r>
+              <w:rPr>
+                <w:rFonts w:ascii="Cambria Math" w:hAnsi="Cambria Math"/>
+                <w:sz w:val="20"/>
+                <w:szCs w:val="20"/>
+              </w:rPr>
+              <m:t>η</m:t>
+            </m:r>
+          </m:e>
+          <m:sub>
+            <m:r>
+              <w:rPr>
+                <w:rFonts w:ascii="Cambria Math" w:hAnsi="Cambria Math"/>
+                <w:sz w:val="20"/>
+                <w:szCs w:val="20"/>
+              </w:rPr>
+              <m:t>C</m:t>
+            </m:r>
+          </m:sub>
+        </m:sSub>
+        <m:r>
+          <m:rPr>
+            <m:sty m:val="p"/>
+          </m:rPr>
+          <w:rPr>
+            <w:rFonts w:ascii="Cambria Math" w:hAnsi="Cambria Math"/>
+            <w:sz w:val="20"/>
+            <w:szCs w:val="20"/>
+          </w:rPr>
+          <m:t>=0.85</m:t>
+        </m:r>
+      </m:oMath>
+      <w:r>
+        <w:rPr>
+          <w:sz w:val="20"/>
+          <w:szCs w:val="20"/>
+        </w:rPr>
+        <w:t> was assumed for both expansion and compression. The resulting net pressure-work balance was defined as </w:t>
+      </w:r>
+      <m:oMath>
+        <m:r>
+          <m:rPr>
+            <m:sty m:val="p"/>
+          </m:rPr>
+          <w:rPr>
+            <w:rFonts w:ascii="Cambria Math" w:hAnsi="Cambria Math"/>
+            <w:sz w:val="20"/>
+            <w:szCs w:val="20"/>
+          </w:rPr>
+          <m:t>Δ</m:t>
+        </m:r>
+        <m:sSub>
+          <m:sSubPr>
+            <m:ctrlPr>
+              <w:rPr>
+                <w:rFonts w:ascii="Cambria Math" w:hAnsi="Cambria Math"/>
+                <w:sz w:val="20"/>
+                <w:szCs w:val="20"/>
+              </w:rPr>
+            </m:ctrlPr>
+          </m:sSubPr>
+          <m:e>
+            <m:r>
+              <w:rPr>
+                <w:rFonts w:ascii="Cambria Math" w:hAnsi="Cambria Math"/>
+                <w:sz w:val="20"/>
+                <w:szCs w:val="20"/>
+              </w:rPr>
+              <m:t>W</m:t>
+            </m:r>
+          </m:e>
+          <m:sub>
+            <m:r>
+              <w:rPr>
+                <w:rFonts w:ascii="Cambria Math" w:hAnsi="Cambria Math"/>
+                <w:sz w:val="20"/>
+                <w:szCs w:val="20"/>
+              </w:rPr>
+              <m:t>E</m:t>
+            </m:r>
+            <m:r>
+              <m:rPr>
+                <m:sty m:val="p"/>
+              </m:rPr>
+              <w:rPr>
+                <w:rFonts w:ascii="Cambria Math" w:hAnsi="Cambria Math"/>
+                <w:sz w:val="20"/>
+                <w:szCs w:val="20"/>
+              </w:rPr>
+              <m:t>-</m:t>
+            </m:r>
+            <m:r>
+              <w:rPr>
+                <w:rFonts w:ascii="Cambria Math" w:hAnsi="Cambria Math"/>
+                <w:sz w:val="20"/>
+                <w:szCs w:val="20"/>
+              </w:rPr>
+              <m:t>C</m:t>
+            </m:r>
+          </m:sub>
+        </m:sSub>
+        <m:r>
+          <m:rPr>
+            <m:sty m:val="p"/>
+          </m:rPr>
+          <w:rPr>
+            <w:rFonts w:ascii="Cambria Math" w:hAnsi="Cambria Math"/>
+            <w:sz w:val="20"/>
+            <w:szCs w:val="20"/>
+          </w:rPr>
+          <m:t>=</m:t>
+        </m:r>
+        <m:sSub>
+          <m:sSubPr>
+            <m:ctrlPr>
+              <w:rPr>
+                <w:rFonts w:ascii="Cambria Math" w:hAnsi="Cambria Math"/>
+                <w:sz w:val="20"/>
+                <w:szCs w:val="20"/>
+              </w:rPr>
+            </m:ctrlPr>
+          </m:sSubPr>
+          <m:e>
+            <m:r>
+              <w:rPr>
+                <w:rFonts w:ascii="Cambria Math" w:hAnsi="Cambria Math"/>
+                <w:sz w:val="20"/>
+                <w:szCs w:val="20"/>
+              </w:rPr>
+              <m:t>W</m:t>
+            </m:r>
+          </m:e>
+          <m:sub>
+            <m:r>
+              <w:rPr>
+                <w:rFonts w:ascii="Cambria Math" w:hAnsi="Cambria Math"/>
+                <w:sz w:val="20"/>
+                <w:szCs w:val="20"/>
+              </w:rPr>
+              <m:t>E</m:t>
+            </m:r>
+          </m:sub>
+        </m:sSub>
+        <m:r>
+          <m:rPr>
+            <m:sty m:val="p"/>
+          </m:rPr>
+          <w:rPr>
+            <w:rFonts w:ascii="Cambria Math" w:hAnsi="Cambria Math"/>
+            <w:sz w:val="20"/>
+            <w:szCs w:val="20"/>
+          </w:rPr>
+          <m:t>-</m:t>
+        </m:r>
+        <m:sSub>
+          <m:sSubPr>
+            <m:ctrlPr>
+              <w:rPr>
+                <w:rFonts w:ascii="Cambria Math" w:hAnsi="Cambria Math"/>
+                <w:sz w:val="20"/>
+                <w:szCs w:val="20"/>
+              </w:rPr>
+            </m:ctrlPr>
+          </m:sSubPr>
+          <m:e>
+            <m:r>
+              <w:rPr>
+                <w:rFonts w:ascii="Cambria Math" w:hAnsi="Cambria Math"/>
+                <w:sz w:val="20"/>
+                <w:szCs w:val="20"/>
+              </w:rPr>
+              <m:t>W</m:t>
+            </m:r>
+          </m:e>
+          <m:sub>
+            <m:r>
+              <w:rPr>
+                <w:rFonts w:ascii="Cambria Math" w:hAnsi="Cambria Math"/>
+                <w:sz w:val="20"/>
+                <w:szCs w:val="20"/>
+              </w:rPr>
+              <m:t>C</m:t>
+            </m:r>
+          </m:sub>
+        </m:sSub>
+      </m:oMath>
+      <w:r>
+        <w:rPr>
+          <w:sz w:val="20"/>
+          <w:szCs w:val="20"/>
+        </w:rPr>
+        <w:t>, where negative values indicate that the avoided downstream hydrogen recompression demand exceeds the recoverable expansion work from natural</w:t>
+      </w:r>
+      <w:r>
+        <w:rPr>
+          <w:sz w:val="20"/>
+          <w:szCs w:val="20"/>
+        </w:rPr>
+        <w:t xml:space="preserve"> </w:t>
+      </w:r>
+      <w:r>
+        <w:rPr>
+          <w:sz w:val="20"/>
+          <w:szCs w:val="20"/>
+        </w:rPr>
+        <w:t xml:space="preserve">gas pressure reduction. All energy terms were finally </w:t>
+      </w:r>
+      <w:r>
+        <w:rPr>
+          <w:sz w:val="20"/>
+          <w:szCs w:val="20"/>
+        </w:rPr>
+        <w:t xml:space="preserve">converted to primary energy and </w:t>
+      </w:r>
+      <w:r>
+        <w:rPr>
+          <w:sz w:val="20"/>
+          <w:szCs w:val="20"/>
+        </w:rPr>
+        <w:t>normalized to the natural</w:t>
+      </w:r>
+      <w:r>
+        <w:rPr>
+          <w:sz w:val="20"/>
+          <w:szCs w:val="20"/>
+        </w:rPr>
+        <w:t xml:space="preserve"> </w:t>
+      </w:r>
+      <w:r>
+        <w:rPr>
+          <w:sz w:val="20"/>
+          <w:szCs w:val="20"/>
+        </w:rPr>
+        <w:t>gas feedstock energy</w:t>
+      </w:r>
+      <w:r>
+        <w:rPr>
+          <w:sz w:val="20"/>
+          <w:szCs w:val="20"/>
+        </w:rPr>
+        <w:t xml:space="preserve"> analog to above</w:t>
+      </w:r>
+      <w:r>
+        <w:rPr>
+          <w:sz w:val="20"/>
+          <w:szCs w:val="20"/>
+        </w:rPr>
+        <w:t>.</w:t>
+      </w:r>
+    </w:p>
+    <w:p>
+      <w:pPr>
+        <w:rPr>
+          <w:sz w:val="20"/>
+          <w:szCs w:val="20"/>
+        </w:rPr>
+      </w:pPr>
+    </w:p>
+    <w:p>
+      <w:pPr>
+        <w:rPr>
+          <w:sz w:val="20"/>
+          <w:szCs w:val="20"/>
+        </w:rPr>
+      </w:pPr>
+      <w:r>
+        <w:rPr>
+          <w:sz w:val="20"/>
+          <w:szCs w:val="20"/>
+        </w:rPr>
+        <w:t xml:space="preserve">To assess the decarbonization potential of the eSMR concept independently of regional energy price distortions, the abatement effectiveness </w:t>
+      </w:r>
+      <w:r>
+        <w:rPr>
+          <w:sz w:val="20"/>
+          <w:szCs w:val="20"/>
+        </w:rPr>
+        <w:t>–</w:t>
+      </w:r>
+      <w:r>
+        <w:rPr>
+          <w:sz w:val="20"/>
+          <w:szCs w:val="20"/>
+        </w:rPr>
+        <w:t xml:space="preserve"> defined as t CO₂ avoided per MWh of renewable electricity input </w:t>
+      </w:r>
+      <w:r>
+        <w:rPr>
+          <w:sz w:val="20"/>
+          <w:szCs w:val="20"/>
+        </w:rPr>
+        <w:t>–</w:t>
+      </w:r>
+      <w:r>
+        <w:rPr>
+          <w:sz w:val="20"/>
+          <w:szCs w:val="20"/>
+        </w:rPr>
+        <w:t xml:space="preserve"> was evaluated under theoretical upper-bound conditions. The metric was derived from the ratio of avoided NG-fired heating emissions to the electrical energy required to drive the reforming reaction</w:t>
+      </w:r>
+      <w:r>
+        <w:rPr>
+          <w:sz w:val="20"/>
+          <w:szCs w:val="20"/>
+        </w:rPr>
+        <w:t xml:space="preserve">. </w:t>
+      </w:r>
+      <w:r>
+        <w:rPr>
+          <w:sz w:val="20"/>
+          <w:szCs w:val="20"/>
+        </w:rPr>
+        <w:t xml:space="preserve">Since the eSMR concept eliminates the steam co-product through internal heat integration, the equivalent steam demand at integrated chemical sites </w:t>
+      </w:r>
+      <w:r>
+        <w:rPr>
+          <w:sz w:val="20"/>
+          <w:szCs w:val="20"/>
+        </w:rPr>
+        <w:t>can</w:t>
+      </w:r>
+      <w:r>
+        <w:rPr>
+          <w:sz w:val="20"/>
+          <w:szCs w:val="20"/>
+        </w:rPr>
+        <w:t xml:space="preserve"> alternatively be supplied via electrified heat generation, contributing an additional abatement effectiveness</w:t>
+      </w:r>
+      <w:r>
+        <w:rPr>
+          <w:sz w:val="20"/>
+          <w:szCs w:val="20"/>
+        </w:rPr>
+        <w:t>.</w:t>
+      </w:r>
+    </w:p>
+    <w:p>
+      <w:pPr>
+        <w:rPr>
+          <w:color w:val="EE0000"/>
+          <w:sz w:val="20"/>
+          <w:szCs w:val="20"/>
+        </w:rPr>
+      </w:pPr>
+      <w:r>
+        <w:rPr>
+          <w:sz w:val="20"/>
+          <w:szCs w:val="20"/>
+        </w:rPr>
+        <w:br w:type="page"/>
+      </w:r>
+    </w:p>
+    <w:p>
+      <w:pPr>
+        <w:rPr>
+          <w:sz w:val="20"/>
+          <w:szCs w:val="20"/>
+          <w:u w:val="single"/>
+        </w:rPr>
+      </w:pPr>
+      <w:r>
+        <w:rPr>
+          <w:sz w:val="20"/>
+          <w:szCs w:val="20"/>
+          <w:u w:val="single"/>
+        </w:rPr>
+        <w:lastRenderedPageBreak/>
         <w:t>Sources:</w:t>
       </w:r>
     </w:p>
@@ -13040,12 +12687,14 @@
         <w:rPr>
           <w:sz w:val="20"/>
           <w:szCs w:val="20"/>
-        </w:rPr>
-      </w:pPr>
-      <w:r>
-        <w:rPr>
-          <w:sz w:val="20"/>
-          <w:szCs w:val="20"/>
+          <w:u w:val="single"/>
+        </w:rPr>
+      </w:pPr>
+      <w:r>
+        <w:rPr>
+          <w:sz w:val="20"/>
+          <w:szCs w:val="20"/>
+          <w:u w:val="single"/>
         </w:rPr>
         <w:t>Appendix</w:t>
       </w:r>
@@ -13053,17 +12702,10 @@
         <w:rPr>
           <w:sz w:val="20"/>
           <w:szCs w:val="20"/>
+          <w:u w:val="single"/>
         </w:rPr>
         <w:t>:</w:t>
       </w:r>
-    </w:p>
-    <w:p>
-      <w:pPr>
-        <w:rPr>
-          <w:sz w:val="20"/>
-          <w:szCs w:val="20"/>
-        </w:rPr>
-      </w:pPr>
     </w:p>
     <w:p>
       <w:pPr>

</xml_diff>